<commit_message>
Prepare Case 2 report for technical defense
Co-authored-by: Copilot <223556219+Copilot@users.noreply.github.com>
</commit_message>
<xml_diff>
--- a/Caso2/docs/INFORME_PRESENTACION_CASO_2.docx
+++ b/Caso2/docs/INFORME_PRESENTACION_CASO_2.docx
@@ -13,6 +13,143 @@
           <w:i w:val="0"/>
         </w:rPr>
         <w:t>Informe de presentación — Caso 2: PromptVault</w:t>
+      </w:r>
+    </w:p>
+    <w:p>
+      <w:pPr>
+        <w:spacing w:after="60"/>
+        <w:jc w:val="center"/>
+      </w:pPr>
+      <w:r>
+        <w:rPr>
+          <w:b/>
+          <w:i w:val="0"/>
+        </w:rPr>
+        <w:t>Universidad Adventista de Bolivia · Ingeniería de Sistemas</w:t>
+      </w:r>
+    </w:p>
+    <w:p>
+      <w:pPr>
+        <w:spacing w:after="60"/>
+        <w:jc w:val="center"/>
+      </w:pPr>
+      <w:r>
+        <w:rPr>
+          <w:b/>
+          <w:i w:val="0"/>
+        </w:rPr>
+        <w:t>Asignatura:</w:t>
+      </w:r>
+      <w:r>
+        <w:rPr>
+          <w:b w:val="0"/>
+          <w:i w:val="0"/>
+        </w:rPr>
+        <w:t xml:space="preserve"> Tecnologías en Internet · </w:t>
+      </w:r>
+      <w:r>
+        <w:rPr>
+          <w:b/>
+          <w:i w:val="0"/>
+        </w:rPr>
+        <w:t>Semestre:</w:t>
+      </w:r>
+      <w:r>
+        <w:rPr>
+          <w:b w:val="0"/>
+          <w:i w:val="0"/>
+        </w:rPr>
+        <w:t xml:space="preserve"> 6.º</w:t>
+      </w:r>
+    </w:p>
+    <w:p>
+      <w:pPr>
+        <w:spacing w:after="60"/>
+        <w:jc w:val="center"/>
+      </w:pPr>
+      <w:r>
+        <w:rPr>
+          <w:b/>
+          <w:i w:val="0"/>
+        </w:rPr>
+        <w:t>Docente:</w:t>
+      </w:r>
+      <w:r>
+        <w:rPr>
+          <w:b w:val="0"/>
+          <w:i w:val="0"/>
+        </w:rPr>
+        <w:t xml:space="preserve"> Víctor Hugo Sarzuri Flores</w:t>
+      </w:r>
+    </w:p>
+    <w:p>
+      <w:pPr>
+        <w:spacing w:after="60"/>
+        <w:jc w:val="center"/>
+      </w:pPr>
+      <w:r>
+        <w:rPr>
+          <w:b/>
+          <w:i w:val="0"/>
+        </w:rPr>
+        <w:t>Estudiante:</w:t>
+      </w:r>
+      <w:r>
+        <w:rPr>
+          <w:b w:val="0"/>
+          <w:i w:val="0"/>
+        </w:rPr>
+        <w:t xml:space="preserve"> Eva Lizeth Chino Quispe</w:t>
+      </w:r>
+    </w:p>
+    <w:p>
+      <w:pPr>
+        <w:spacing w:after="60"/>
+        <w:jc w:val="center"/>
+      </w:pPr>
+      <w:r>
+        <w:rPr>
+          <w:b/>
+          <w:i w:val="0"/>
+        </w:rPr>
+        <w:t>Fecha de presentación:</w:t>
+      </w:r>
+      <w:r>
+        <w:rPr>
+          <w:b w:val="0"/>
+          <w:i w:val="0"/>
+        </w:rPr>
+        <w:t xml:space="preserve"> 21 de octubre de 2026</w:t>
+      </w:r>
+    </w:p>
+    <w:p>
+      <w:pPr>
+        <w:spacing w:after="60"/>
+        <w:jc w:val="center"/>
+      </w:pPr>
+      <w:r>
+        <w:rPr>
+          <w:b w:val="0"/>
+          <w:i w:val="0"/>
+        </w:rPr>
+        <w:t xml:space="preserve">Evidencias capturadas durante la ejecución en la carpeta </w:t>
+      </w:r>
+      <w:r>
+        <w:rPr>
+          <w:rFonts w:ascii="Consolas" w:hAnsi="Consolas"/>
+          <w:b w:val="0"/>
+          <w:i w:val="0"/>
+          <w:color w:val="167C80"/>
+          <w:sz w:val="18"/>
+        </w:rPr>
+        <w:t>evidencias/</w:t>
+      </w:r>
+      <w:r>
+        <w:rPr>
+          <w:b w:val="0"/>
+          <w:i w:val="0"/>
+        </w:rPr>
+        <w:t>.</w:t>
       </w:r>
     </w:p>
     <w:p>
@@ -214,25 +351,18 @@
         <w:tblStyle w:val="TableGrid"/>
         <w:tblW w:type="auto" w:w="0"/>
         <w:jc w:val="center"/>
-        <w:tblLayout w:type="autofit"/>
         <w:tblLook w:firstColumn="1" w:firstRow="1" w:lastColumn="0" w:lastRow="0" w:noHBand="0" w:noVBand="1" w:val="04A0"/>
       </w:tblPr>
       <w:tblGrid>
-        <w:gridCol w:w="3331"/>
-        <w:gridCol w:w="3331"/>
-        <w:gridCol w:w="3331"/>
+        <w:gridCol w:w="3312"/>
+        <w:gridCol w:w="3312"/>
+        <w:gridCol w:w="3312"/>
       </w:tblGrid>
       <w:tr>
         <w:tc>
           <w:tcPr>
-            <w:tcW w:type="dxa" w:w="3331"/>
+            <w:tcW w:type="dxa" w:w="3312"/>
             <w:vAlign w:val="center"/>
-            <w:tcMar>
-              <w:top w:w="90" w:type="dxa"/>
-              <w:start w:w="100" w:type="dxa"/>
-              <w:bottom w:w="90" w:type="dxa"/>
-              <w:end w:w="100" w:type="dxa"/>
-            </w:tcMar>
             <w:shd w:fill="17365D"/>
           </w:tcPr>
           <w:p>
@@ -259,14 +389,8 @@
         </w:tc>
         <w:tc>
           <w:tcPr>
-            <w:tcW w:type="dxa" w:w="3331"/>
+            <w:tcW w:type="dxa" w:w="3312"/>
             <w:vAlign w:val="center"/>
-            <w:tcMar>
-              <w:top w:w="90" w:type="dxa"/>
-              <w:start w:w="100" w:type="dxa"/>
-              <w:bottom w:w="90" w:type="dxa"/>
-              <w:end w:w="100" w:type="dxa"/>
-            </w:tcMar>
             <w:shd w:fill="17365D"/>
           </w:tcPr>
           <w:p>
@@ -293,14 +417,8 @@
         </w:tc>
         <w:tc>
           <w:tcPr>
-            <w:tcW w:type="dxa" w:w="3331"/>
+            <w:tcW w:type="dxa" w:w="3312"/>
             <w:vAlign w:val="center"/>
-            <w:tcMar>
-              <w:top w:w="90" w:type="dxa"/>
-              <w:start w:w="100" w:type="dxa"/>
-              <w:bottom w:w="90" w:type="dxa"/>
-              <w:end w:w="100" w:type="dxa"/>
-            </w:tcMar>
             <w:shd w:fill="17365D"/>
           </w:tcPr>
           <w:p>
@@ -329,14 +447,8 @@
       <w:tr>
         <w:tc>
           <w:tcPr>
-            <w:tcW w:type="dxa" w:w="3331"/>
+            <w:tcW w:type="dxa" w:w="3312"/>
             <w:vAlign w:val="center"/>
-            <w:tcMar>
-              <w:top w:w="90" w:type="dxa"/>
-              <w:start w:w="100" w:type="dxa"/>
-              <w:bottom w:w="90" w:type="dxa"/>
-              <w:end w:w="100" w:type="dxa"/>
-            </w:tcMar>
           </w:tcPr>
           <w:p>
             <w:pPr>
@@ -359,14 +471,8 @@
         </w:tc>
         <w:tc>
           <w:tcPr>
-            <w:tcW w:type="dxa" w:w="3331"/>
+            <w:tcW w:type="dxa" w:w="3312"/>
             <w:vAlign w:val="center"/>
-            <w:tcMar>
-              <w:top w:w="90" w:type="dxa"/>
-              <w:start w:w="100" w:type="dxa"/>
-              <w:bottom w:w="90" w:type="dxa"/>
-              <w:end w:w="100" w:type="dxa"/>
-            </w:tcMar>
           </w:tcPr>
           <w:p>
             <w:pPr>
@@ -391,14 +497,8 @@
         </w:tc>
         <w:tc>
           <w:tcPr>
-            <w:tcW w:type="dxa" w:w="3331"/>
+            <w:tcW w:type="dxa" w:w="3312"/>
             <w:vAlign w:val="center"/>
-            <w:tcMar>
-              <w:top w:w="90" w:type="dxa"/>
-              <w:start w:w="100" w:type="dxa"/>
-              <w:bottom w:w="90" w:type="dxa"/>
-              <w:end w:w="100" w:type="dxa"/>
-            </w:tcMar>
           </w:tcPr>
           <w:p>
             <w:pPr>
@@ -423,14 +523,8 @@
       <w:tr>
         <w:tc>
           <w:tcPr>
-            <w:tcW w:type="dxa" w:w="3331"/>
+            <w:tcW w:type="dxa" w:w="3312"/>
             <w:vAlign w:val="center"/>
-            <w:tcMar>
-              <w:top w:w="90" w:type="dxa"/>
-              <w:start w:w="100" w:type="dxa"/>
-              <w:bottom w:w="90" w:type="dxa"/>
-              <w:end w:w="100" w:type="dxa"/>
-            </w:tcMar>
             <w:shd w:fill="F5F8FA"/>
           </w:tcPr>
           <w:p>
@@ -454,14 +548,8 @@
         </w:tc>
         <w:tc>
           <w:tcPr>
-            <w:tcW w:type="dxa" w:w="3331"/>
+            <w:tcW w:type="dxa" w:w="3312"/>
             <w:vAlign w:val="center"/>
-            <w:tcMar>
-              <w:top w:w="90" w:type="dxa"/>
-              <w:start w:w="100" w:type="dxa"/>
-              <w:bottom w:w="90" w:type="dxa"/>
-              <w:end w:w="100" w:type="dxa"/>
-            </w:tcMar>
             <w:shd w:fill="F5F8FA"/>
           </w:tcPr>
           <w:p>
@@ -487,14 +575,8 @@
         </w:tc>
         <w:tc>
           <w:tcPr>
-            <w:tcW w:type="dxa" w:w="3331"/>
+            <w:tcW w:type="dxa" w:w="3312"/>
             <w:vAlign w:val="center"/>
-            <w:tcMar>
-              <w:top w:w="90" w:type="dxa"/>
-              <w:start w:w="100" w:type="dxa"/>
-              <w:bottom w:w="90" w:type="dxa"/>
-              <w:end w:w="100" w:type="dxa"/>
-            </w:tcMar>
             <w:shd w:fill="F5F8FA"/>
           </w:tcPr>
           <w:p>
@@ -520,14 +602,8 @@
       <w:tr>
         <w:tc>
           <w:tcPr>
-            <w:tcW w:type="dxa" w:w="3331"/>
+            <w:tcW w:type="dxa" w:w="3312"/>
             <w:vAlign w:val="center"/>
-            <w:tcMar>
-              <w:top w:w="90" w:type="dxa"/>
-              <w:start w:w="100" w:type="dxa"/>
-              <w:bottom w:w="90" w:type="dxa"/>
-              <w:end w:w="100" w:type="dxa"/>
-            </w:tcMar>
           </w:tcPr>
           <w:p>
             <w:pPr>
@@ -550,14 +626,8 @@
         </w:tc>
         <w:tc>
           <w:tcPr>
-            <w:tcW w:type="dxa" w:w="3331"/>
+            <w:tcW w:type="dxa" w:w="3312"/>
             <w:vAlign w:val="center"/>
-            <w:tcMar>
-              <w:top w:w="90" w:type="dxa"/>
-              <w:start w:w="100" w:type="dxa"/>
-              <w:bottom w:w="90" w:type="dxa"/>
-              <w:end w:w="100" w:type="dxa"/>
-            </w:tcMar>
           </w:tcPr>
           <w:p>
             <w:pPr>
@@ -582,14 +652,8 @@
         </w:tc>
         <w:tc>
           <w:tcPr>
-            <w:tcW w:type="dxa" w:w="3331"/>
+            <w:tcW w:type="dxa" w:w="3312"/>
             <w:vAlign w:val="center"/>
-            <w:tcMar>
-              <w:top w:w="90" w:type="dxa"/>
-              <w:start w:w="100" w:type="dxa"/>
-              <w:bottom w:w="90" w:type="dxa"/>
-              <w:end w:w="100" w:type="dxa"/>
-            </w:tcMar>
           </w:tcPr>
           <w:p>
             <w:pPr>
@@ -614,14 +678,8 @@
       <w:tr>
         <w:tc>
           <w:tcPr>
-            <w:tcW w:type="dxa" w:w="3331"/>
+            <w:tcW w:type="dxa" w:w="3312"/>
             <w:vAlign w:val="center"/>
-            <w:tcMar>
-              <w:top w:w="90" w:type="dxa"/>
-              <w:start w:w="100" w:type="dxa"/>
-              <w:bottom w:w="90" w:type="dxa"/>
-              <w:end w:w="100" w:type="dxa"/>
-            </w:tcMar>
             <w:shd w:fill="F5F8FA"/>
           </w:tcPr>
           <w:p>
@@ -645,14 +703,8 @@
         </w:tc>
         <w:tc>
           <w:tcPr>
-            <w:tcW w:type="dxa" w:w="3331"/>
+            <w:tcW w:type="dxa" w:w="3312"/>
             <w:vAlign w:val="center"/>
-            <w:tcMar>
-              <w:top w:w="90" w:type="dxa"/>
-              <w:start w:w="100" w:type="dxa"/>
-              <w:bottom w:w="90" w:type="dxa"/>
-              <w:end w:w="100" w:type="dxa"/>
-            </w:tcMar>
             <w:shd w:fill="F5F8FA"/>
           </w:tcPr>
           <w:p>
@@ -678,14 +730,8 @@
         </w:tc>
         <w:tc>
           <w:tcPr>
-            <w:tcW w:type="dxa" w:w="3331"/>
+            <w:tcW w:type="dxa" w:w="3312"/>
             <w:vAlign w:val="center"/>
-            <w:tcMar>
-              <w:top w:w="90" w:type="dxa"/>
-              <w:start w:w="100" w:type="dxa"/>
-              <w:bottom w:w="90" w:type="dxa"/>
-              <w:end w:w="100" w:type="dxa"/>
-            </w:tcMar>
             <w:shd w:fill="F5F8FA"/>
           </w:tcPr>
           <w:p>
@@ -711,14 +757,8 @@
       <w:tr>
         <w:tc>
           <w:tcPr>
-            <w:tcW w:type="dxa" w:w="3331"/>
+            <w:tcW w:type="dxa" w:w="3312"/>
             <w:vAlign w:val="center"/>
-            <w:tcMar>
-              <w:top w:w="90" w:type="dxa"/>
-              <w:start w:w="100" w:type="dxa"/>
-              <w:bottom w:w="90" w:type="dxa"/>
-              <w:end w:w="100" w:type="dxa"/>
-            </w:tcMar>
           </w:tcPr>
           <w:p>
             <w:pPr>
@@ -741,14 +781,8 @@
         </w:tc>
         <w:tc>
           <w:tcPr>
-            <w:tcW w:type="dxa" w:w="3331"/>
+            <w:tcW w:type="dxa" w:w="3312"/>
             <w:vAlign w:val="center"/>
-            <w:tcMar>
-              <w:top w:w="90" w:type="dxa"/>
-              <w:start w:w="100" w:type="dxa"/>
-              <w:bottom w:w="90" w:type="dxa"/>
-              <w:end w:w="100" w:type="dxa"/>
-            </w:tcMar>
           </w:tcPr>
           <w:p>
             <w:pPr>
@@ -773,14 +807,8 @@
         </w:tc>
         <w:tc>
           <w:tcPr>
-            <w:tcW w:type="dxa" w:w="3331"/>
+            <w:tcW w:type="dxa" w:w="3312"/>
             <w:vAlign w:val="center"/>
-            <w:tcMar>
-              <w:top w:w="90" w:type="dxa"/>
-              <w:start w:w="100" w:type="dxa"/>
-              <w:bottom w:w="90" w:type="dxa"/>
-              <w:end w:w="100" w:type="dxa"/>
-            </w:tcMar>
           </w:tcPr>
           <w:p>
             <w:pPr>
@@ -805,14 +833,8 @@
       <w:tr>
         <w:tc>
           <w:tcPr>
-            <w:tcW w:type="dxa" w:w="3331"/>
+            <w:tcW w:type="dxa" w:w="3312"/>
             <w:vAlign w:val="center"/>
-            <w:tcMar>
-              <w:top w:w="90" w:type="dxa"/>
-              <w:start w:w="100" w:type="dxa"/>
-              <w:bottom w:w="90" w:type="dxa"/>
-              <w:end w:w="100" w:type="dxa"/>
-            </w:tcMar>
             <w:shd w:fill="F5F8FA"/>
           </w:tcPr>
           <w:p>
@@ -836,14 +858,8 @@
         </w:tc>
         <w:tc>
           <w:tcPr>
-            <w:tcW w:type="dxa" w:w="3331"/>
+            <w:tcW w:type="dxa" w:w="3312"/>
             <w:vAlign w:val="center"/>
-            <w:tcMar>
-              <w:top w:w="90" w:type="dxa"/>
-              <w:start w:w="100" w:type="dxa"/>
-              <w:bottom w:w="90" w:type="dxa"/>
-              <w:end w:w="100" w:type="dxa"/>
-            </w:tcMar>
             <w:shd w:fill="F5F8FA"/>
           </w:tcPr>
           <w:p>
@@ -869,14 +885,8 @@
         </w:tc>
         <w:tc>
           <w:tcPr>
-            <w:tcW w:type="dxa" w:w="3331"/>
+            <w:tcW w:type="dxa" w:w="3312"/>
             <w:vAlign w:val="center"/>
-            <w:tcMar>
-              <w:top w:w="90" w:type="dxa"/>
-              <w:start w:w="100" w:type="dxa"/>
-              <w:bottom w:w="90" w:type="dxa"/>
-              <w:end w:w="100" w:type="dxa"/>
-            </w:tcMar>
             <w:shd w:fill="F5F8FA"/>
           </w:tcPr>
           <w:p>
@@ -974,26 +984,19 @@
         <w:tblStyle w:val="TableGrid"/>
         <w:tblW w:type="auto" w:w="0"/>
         <w:jc w:val="center"/>
-        <w:tblLayout w:type="autofit"/>
         <w:tblLook w:firstColumn="1" w:firstRow="1" w:lastColumn="0" w:lastRow="0" w:noHBand="0" w:noVBand="1" w:val="04A0"/>
       </w:tblPr>
       <w:tblGrid>
-        <w:gridCol w:w="2498"/>
-        <w:gridCol w:w="2498"/>
-        <w:gridCol w:w="2498"/>
-        <w:gridCol w:w="2498"/>
+        <w:gridCol w:w="2484"/>
+        <w:gridCol w:w="2484"/>
+        <w:gridCol w:w="2484"/>
+        <w:gridCol w:w="2484"/>
       </w:tblGrid>
       <w:tr>
         <w:tc>
           <w:tcPr>
-            <w:tcW w:type="dxa" w:w="2498"/>
+            <w:tcW w:type="dxa" w:w="2484"/>
             <w:vAlign w:val="center"/>
-            <w:tcMar>
-              <w:top w:w="90" w:type="dxa"/>
-              <w:start w:w="100" w:type="dxa"/>
-              <w:bottom w:w="90" w:type="dxa"/>
-              <w:end w:w="100" w:type="dxa"/>
-            </w:tcMar>
             <w:shd w:fill="17365D"/>
           </w:tcPr>
           <w:p>
@@ -1020,14 +1023,8 @@
         </w:tc>
         <w:tc>
           <w:tcPr>
-            <w:tcW w:type="dxa" w:w="2498"/>
+            <w:tcW w:type="dxa" w:w="2484"/>
             <w:vAlign w:val="center"/>
-            <w:tcMar>
-              <w:top w:w="90" w:type="dxa"/>
-              <w:start w:w="100" w:type="dxa"/>
-              <w:bottom w:w="90" w:type="dxa"/>
-              <w:end w:w="100" w:type="dxa"/>
-            </w:tcMar>
             <w:shd w:fill="17365D"/>
           </w:tcPr>
           <w:p>
@@ -1054,14 +1051,8 @@
         </w:tc>
         <w:tc>
           <w:tcPr>
-            <w:tcW w:type="dxa" w:w="2498"/>
+            <w:tcW w:type="dxa" w:w="2484"/>
             <w:vAlign w:val="center"/>
-            <w:tcMar>
-              <w:top w:w="90" w:type="dxa"/>
-              <w:start w:w="100" w:type="dxa"/>
-              <w:bottom w:w="90" w:type="dxa"/>
-              <w:end w:w="100" w:type="dxa"/>
-            </w:tcMar>
             <w:shd w:fill="17365D"/>
           </w:tcPr>
           <w:p>
@@ -1088,14 +1079,8 @@
         </w:tc>
         <w:tc>
           <w:tcPr>
-            <w:tcW w:type="dxa" w:w="2498"/>
+            <w:tcW w:type="dxa" w:w="2484"/>
             <w:vAlign w:val="center"/>
-            <w:tcMar>
-              <w:top w:w="90" w:type="dxa"/>
-              <w:start w:w="100" w:type="dxa"/>
-              <w:bottom w:w="90" w:type="dxa"/>
-              <w:end w:w="100" w:type="dxa"/>
-            </w:tcMar>
             <w:shd w:fill="17365D"/>
           </w:tcPr>
           <w:p>
@@ -1124,14 +1109,8 @@
       <w:tr>
         <w:tc>
           <w:tcPr>
-            <w:tcW w:type="dxa" w:w="2498"/>
+            <w:tcW w:type="dxa" w:w="2484"/>
             <w:vAlign w:val="center"/>
-            <w:tcMar>
-              <w:top w:w="90" w:type="dxa"/>
-              <w:start w:w="100" w:type="dxa"/>
-              <w:bottom w:w="90" w:type="dxa"/>
-              <w:end w:w="100" w:type="dxa"/>
-            </w:tcMar>
           </w:tcPr>
           <w:p>
             <w:pPr>
@@ -1154,14 +1133,8 @@
         </w:tc>
         <w:tc>
           <w:tcPr>
-            <w:tcW w:type="dxa" w:w="2498"/>
+            <w:tcW w:type="dxa" w:w="2484"/>
             <w:vAlign w:val="center"/>
-            <w:tcMar>
-              <w:top w:w="90" w:type="dxa"/>
-              <w:start w:w="100" w:type="dxa"/>
-              <w:bottom w:w="90" w:type="dxa"/>
-              <w:end w:w="100" w:type="dxa"/>
-            </w:tcMar>
           </w:tcPr>
           <w:p>
             <w:pPr>
@@ -1186,14 +1159,8 @@
         </w:tc>
         <w:tc>
           <w:tcPr>
-            <w:tcW w:type="dxa" w:w="2498"/>
+            <w:tcW w:type="dxa" w:w="2484"/>
             <w:vAlign w:val="center"/>
-            <w:tcMar>
-              <w:top w:w="90" w:type="dxa"/>
-              <w:start w:w="100" w:type="dxa"/>
-              <w:bottom w:w="90" w:type="dxa"/>
-              <w:end w:w="100" w:type="dxa"/>
-            </w:tcMar>
           </w:tcPr>
           <w:p>
             <w:pPr>
@@ -1216,14 +1183,8 @@
         </w:tc>
         <w:tc>
           <w:tcPr>
-            <w:tcW w:type="dxa" w:w="2498"/>
+            <w:tcW w:type="dxa" w:w="2484"/>
             <w:vAlign w:val="center"/>
-            <w:tcMar>
-              <w:top w:w="90" w:type="dxa"/>
-              <w:start w:w="100" w:type="dxa"/>
-              <w:bottom w:w="90" w:type="dxa"/>
-              <w:end w:w="100" w:type="dxa"/>
-            </w:tcMar>
           </w:tcPr>
           <w:p>
             <w:pPr>
@@ -1248,14 +1209,8 @@
       <w:tr>
         <w:tc>
           <w:tcPr>
-            <w:tcW w:type="dxa" w:w="2498"/>
+            <w:tcW w:type="dxa" w:w="2484"/>
             <w:vAlign w:val="center"/>
-            <w:tcMar>
-              <w:top w:w="90" w:type="dxa"/>
-              <w:start w:w="100" w:type="dxa"/>
-              <w:bottom w:w="90" w:type="dxa"/>
-              <w:end w:w="100" w:type="dxa"/>
-            </w:tcMar>
             <w:shd w:fill="F5F8FA"/>
           </w:tcPr>
           <w:p>
@@ -1279,14 +1234,8 @@
         </w:tc>
         <w:tc>
           <w:tcPr>
-            <w:tcW w:type="dxa" w:w="2498"/>
+            <w:tcW w:type="dxa" w:w="2484"/>
             <w:vAlign w:val="center"/>
-            <w:tcMar>
-              <w:top w:w="90" w:type="dxa"/>
-              <w:start w:w="100" w:type="dxa"/>
-              <w:bottom w:w="90" w:type="dxa"/>
-              <w:end w:w="100" w:type="dxa"/>
-            </w:tcMar>
             <w:shd w:fill="F5F8FA"/>
           </w:tcPr>
           <w:p>
@@ -1312,14 +1261,8 @@
         </w:tc>
         <w:tc>
           <w:tcPr>
-            <w:tcW w:type="dxa" w:w="2498"/>
+            <w:tcW w:type="dxa" w:w="2484"/>
             <w:vAlign w:val="center"/>
-            <w:tcMar>
-              <w:top w:w="90" w:type="dxa"/>
-              <w:start w:w="100" w:type="dxa"/>
-              <w:bottom w:w="90" w:type="dxa"/>
-              <w:end w:w="100" w:type="dxa"/>
-            </w:tcMar>
             <w:shd w:fill="F5F8FA"/>
           </w:tcPr>
           <w:p>
@@ -1343,14 +1286,8 @@
         </w:tc>
         <w:tc>
           <w:tcPr>
-            <w:tcW w:type="dxa" w:w="2498"/>
+            <w:tcW w:type="dxa" w:w="2484"/>
             <w:vAlign w:val="center"/>
-            <w:tcMar>
-              <w:top w:w="90" w:type="dxa"/>
-              <w:start w:w="100" w:type="dxa"/>
-              <w:bottom w:w="90" w:type="dxa"/>
-              <w:end w:w="100" w:type="dxa"/>
-            </w:tcMar>
             <w:shd w:fill="F5F8FA"/>
           </w:tcPr>
           <w:p>
@@ -1376,14 +1313,8 @@
       <w:tr>
         <w:tc>
           <w:tcPr>
-            <w:tcW w:type="dxa" w:w="2498"/>
+            <w:tcW w:type="dxa" w:w="2484"/>
             <w:vAlign w:val="center"/>
-            <w:tcMar>
-              <w:top w:w="90" w:type="dxa"/>
-              <w:start w:w="100" w:type="dxa"/>
-              <w:bottom w:w="90" w:type="dxa"/>
-              <w:end w:w="100" w:type="dxa"/>
-            </w:tcMar>
           </w:tcPr>
           <w:p>
             <w:pPr>
@@ -1406,14 +1337,8 @@
         </w:tc>
         <w:tc>
           <w:tcPr>
-            <w:tcW w:type="dxa" w:w="2498"/>
+            <w:tcW w:type="dxa" w:w="2484"/>
             <w:vAlign w:val="center"/>
-            <w:tcMar>
-              <w:top w:w="90" w:type="dxa"/>
-              <w:start w:w="100" w:type="dxa"/>
-              <w:bottom w:w="90" w:type="dxa"/>
-              <w:end w:w="100" w:type="dxa"/>
-            </w:tcMar>
           </w:tcPr>
           <w:p>
             <w:pPr>
@@ -1438,14 +1363,8 @@
         </w:tc>
         <w:tc>
           <w:tcPr>
-            <w:tcW w:type="dxa" w:w="2498"/>
+            <w:tcW w:type="dxa" w:w="2484"/>
             <w:vAlign w:val="center"/>
-            <w:tcMar>
-              <w:top w:w="90" w:type="dxa"/>
-              <w:start w:w="100" w:type="dxa"/>
-              <w:bottom w:w="90" w:type="dxa"/>
-              <w:end w:w="100" w:type="dxa"/>
-            </w:tcMar>
           </w:tcPr>
           <w:p>
             <w:pPr>
@@ -1468,14 +1387,8 @@
         </w:tc>
         <w:tc>
           <w:tcPr>
-            <w:tcW w:type="dxa" w:w="2498"/>
+            <w:tcW w:type="dxa" w:w="2484"/>
             <w:vAlign w:val="center"/>
-            <w:tcMar>
-              <w:top w:w="90" w:type="dxa"/>
-              <w:start w:w="100" w:type="dxa"/>
-              <w:bottom w:w="90" w:type="dxa"/>
-              <w:end w:w="100" w:type="dxa"/>
-            </w:tcMar>
           </w:tcPr>
           <w:p>
             <w:pPr>
@@ -1500,14 +1413,8 @@
       <w:tr>
         <w:tc>
           <w:tcPr>
-            <w:tcW w:type="dxa" w:w="2498"/>
+            <w:tcW w:type="dxa" w:w="2484"/>
             <w:vAlign w:val="center"/>
-            <w:tcMar>
-              <w:top w:w="90" w:type="dxa"/>
-              <w:start w:w="100" w:type="dxa"/>
-              <w:bottom w:w="90" w:type="dxa"/>
-              <w:end w:w="100" w:type="dxa"/>
-            </w:tcMar>
             <w:shd w:fill="F5F8FA"/>
           </w:tcPr>
           <w:p>
@@ -1531,14 +1438,8 @@
         </w:tc>
         <w:tc>
           <w:tcPr>
-            <w:tcW w:type="dxa" w:w="2498"/>
+            <w:tcW w:type="dxa" w:w="2484"/>
             <w:vAlign w:val="center"/>
-            <w:tcMar>
-              <w:top w:w="90" w:type="dxa"/>
-              <w:start w:w="100" w:type="dxa"/>
-              <w:bottom w:w="90" w:type="dxa"/>
-              <w:end w:w="100" w:type="dxa"/>
-            </w:tcMar>
             <w:shd w:fill="F5F8FA"/>
           </w:tcPr>
           <w:p>
@@ -1564,14 +1465,8 @@
         </w:tc>
         <w:tc>
           <w:tcPr>
-            <w:tcW w:type="dxa" w:w="2498"/>
+            <w:tcW w:type="dxa" w:w="2484"/>
             <w:vAlign w:val="center"/>
-            <w:tcMar>
-              <w:top w:w="90" w:type="dxa"/>
-              <w:start w:w="100" w:type="dxa"/>
-              <w:bottom w:w="90" w:type="dxa"/>
-              <w:end w:w="100" w:type="dxa"/>
-            </w:tcMar>
             <w:shd w:fill="F5F8FA"/>
           </w:tcPr>
           <w:p>
@@ -1595,14 +1490,8 @@
         </w:tc>
         <w:tc>
           <w:tcPr>
-            <w:tcW w:type="dxa" w:w="2498"/>
+            <w:tcW w:type="dxa" w:w="2484"/>
             <w:vAlign w:val="center"/>
-            <w:tcMar>
-              <w:top w:w="90" w:type="dxa"/>
-              <w:start w:w="100" w:type="dxa"/>
-              <w:bottom w:w="90" w:type="dxa"/>
-              <w:end w:w="100" w:type="dxa"/>
-            </w:tcMar>
             <w:shd w:fill="F5F8FA"/>
           </w:tcPr>
           <w:p>
@@ -1628,14 +1517,8 @@
       <w:tr>
         <w:tc>
           <w:tcPr>
-            <w:tcW w:type="dxa" w:w="2498"/>
+            <w:tcW w:type="dxa" w:w="2484"/>
             <w:vAlign w:val="center"/>
-            <w:tcMar>
-              <w:top w:w="90" w:type="dxa"/>
-              <w:start w:w="100" w:type="dxa"/>
-              <w:bottom w:w="90" w:type="dxa"/>
-              <w:end w:w="100" w:type="dxa"/>
-            </w:tcMar>
           </w:tcPr>
           <w:p>
             <w:pPr>
@@ -1658,14 +1541,8 @@
         </w:tc>
         <w:tc>
           <w:tcPr>
-            <w:tcW w:type="dxa" w:w="2498"/>
+            <w:tcW w:type="dxa" w:w="2484"/>
             <w:vAlign w:val="center"/>
-            <w:tcMar>
-              <w:top w:w="90" w:type="dxa"/>
-              <w:start w:w="100" w:type="dxa"/>
-              <w:bottom w:w="90" w:type="dxa"/>
-              <w:end w:w="100" w:type="dxa"/>
-            </w:tcMar>
           </w:tcPr>
           <w:p>
             <w:pPr>
@@ -1690,14 +1567,8 @@
         </w:tc>
         <w:tc>
           <w:tcPr>
-            <w:tcW w:type="dxa" w:w="2498"/>
+            <w:tcW w:type="dxa" w:w="2484"/>
             <w:vAlign w:val="center"/>
-            <w:tcMar>
-              <w:top w:w="90" w:type="dxa"/>
-              <w:start w:w="100" w:type="dxa"/>
-              <w:bottom w:w="90" w:type="dxa"/>
-              <w:end w:w="100" w:type="dxa"/>
-            </w:tcMar>
           </w:tcPr>
           <w:p>
             <w:pPr>
@@ -1720,14 +1591,8 @@
         </w:tc>
         <w:tc>
           <w:tcPr>
-            <w:tcW w:type="dxa" w:w="2498"/>
+            <w:tcW w:type="dxa" w:w="2484"/>
             <w:vAlign w:val="center"/>
-            <w:tcMar>
-              <w:top w:w="90" w:type="dxa"/>
-              <w:start w:w="100" w:type="dxa"/>
-              <w:bottom w:w="90" w:type="dxa"/>
-              <w:end w:w="100" w:type="dxa"/>
-            </w:tcMar>
           </w:tcPr>
           <w:p>
             <w:pPr>
@@ -1752,14 +1617,8 @@
       <w:tr>
         <w:tc>
           <w:tcPr>
-            <w:tcW w:type="dxa" w:w="2498"/>
+            <w:tcW w:type="dxa" w:w="2484"/>
             <w:vAlign w:val="center"/>
-            <w:tcMar>
-              <w:top w:w="90" w:type="dxa"/>
-              <w:start w:w="100" w:type="dxa"/>
-              <w:bottom w:w="90" w:type="dxa"/>
-              <w:end w:w="100" w:type="dxa"/>
-            </w:tcMar>
             <w:shd w:fill="F5F8FA"/>
           </w:tcPr>
           <w:p>
@@ -1783,14 +1642,8 @@
         </w:tc>
         <w:tc>
           <w:tcPr>
-            <w:tcW w:type="dxa" w:w="2498"/>
+            <w:tcW w:type="dxa" w:w="2484"/>
             <w:vAlign w:val="center"/>
-            <w:tcMar>
-              <w:top w:w="90" w:type="dxa"/>
-              <w:start w:w="100" w:type="dxa"/>
-              <w:bottom w:w="90" w:type="dxa"/>
-              <w:end w:w="100" w:type="dxa"/>
-            </w:tcMar>
             <w:shd w:fill="F5F8FA"/>
           </w:tcPr>
           <w:p>
@@ -1816,14 +1669,8 @@
         </w:tc>
         <w:tc>
           <w:tcPr>
-            <w:tcW w:type="dxa" w:w="2498"/>
+            <w:tcW w:type="dxa" w:w="2484"/>
             <w:vAlign w:val="center"/>
-            <w:tcMar>
-              <w:top w:w="90" w:type="dxa"/>
-              <w:start w:w="100" w:type="dxa"/>
-              <w:bottom w:w="90" w:type="dxa"/>
-              <w:end w:w="100" w:type="dxa"/>
-            </w:tcMar>
             <w:shd w:fill="F5F8FA"/>
           </w:tcPr>
           <w:p>
@@ -1847,14 +1694,8 @@
         </w:tc>
         <w:tc>
           <w:tcPr>
-            <w:tcW w:type="dxa" w:w="2498"/>
+            <w:tcW w:type="dxa" w:w="2484"/>
             <w:vAlign w:val="center"/>
-            <w:tcMar>
-              <w:top w:w="90" w:type="dxa"/>
-              <w:start w:w="100" w:type="dxa"/>
-              <w:bottom w:w="90" w:type="dxa"/>
-              <w:end w:w="100" w:type="dxa"/>
-            </w:tcMar>
             <w:shd w:fill="F5F8FA"/>
           </w:tcPr>
           <w:p>
@@ -1880,14 +1721,8 @@
       <w:tr>
         <w:tc>
           <w:tcPr>
-            <w:tcW w:type="dxa" w:w="2498"/>
+            <w:tcW w:type="dxa" w:w="2484"/>
             <w:vAlign w:val="center"/>
-            <w:tcMar>
-              <w:top w:w="90" w:type="dxa"/>
-              <w:start w:w="100" w:type="dxa"/>
-              <w:bottom w:w="90" w:type="dxa"/>
-              <w:end w:w="100" w:type="dxa"/>
-            </w:tcMar>
           </w:tcPr>
           <w:p>
             <w:pPr>
@@ -1910,14 +1745,8 @@
         </w:tc>
         <w:tc>
           <w:tcPr>
-            <w:tcW w:type="dxa" w:w="2498"/>
+            <w:tcW w:type="dxa" w:w="2484"/>
             <w:vAlign w:val="center"/>
-            <w:tcMar>
-              <w:top w:w="90" w:type="dxa"/>
-              <w:start w:w="100" w:type="dxa"/>
-              <w:bottom w:w="90" w:type="dxa"/>
-              <w:end w:w="100" w:type="dxa"/>
-            </w:tcMar>
           </w:tcPr>
           <w:p>
             <w:pPr>
@@ -1942,14 +1771,8 @@
         </w:tc>
         <w:tc>
           <w:tcPr>
-            <w:tcW w:type="dxa" w:w="2498"/>
+            <w:tcW w:type="dxa" w:w="2484"/>
             <w:vAlign w:val="center"/>
-            <w:tcMar>
-              <w:top w:w="90" w:type="dxa"/>
-              <w:start w:w="100" w:type="dxa"/>
-              <w:bottom w:w="90" w:type="dxa"/>
-              <w:end w:w="100" w:type="dxa"/>
-            </w:tcMar>
           </w:tcPr>
           <w:p>
             <w:pPr>
@@ -1972,14 +1795,8 @@
         </w:tc>
         <w:tc>
           <w:tcPr>
-            <w:tcW w:type="dxa" w:w="2498"/>
+            <w:tcW w:type="dxa" w:w="2484"/>
             <w:vAlign w:val="center"/>
-            <w:tcMar>
-              <w:top w:w="90" w:type="dxa"/>
-              <w:start w:w="100" w:type="dxa"/>
-              <w:bottom w:w="90" w:type="dxa"/>
-              <w:end w:w="100" w:type="dxa"/>
-            </w:tcMar>
           </w:tcPr>
           <w:p>
             <w:pPr>
@@ -2004,14 +1821,8 @@
       <w:tr>
         <w:tc>
           <w:tcPr>
-            <w:tcW w:type="dxa" w:w="2498"/>
+            <w:tcW w:type="dxa" w:w="2484"/>
             <w:vAlign w:val="center"/>
-            <w:tcMar>
-              <w:top w:w="90" w:type="dxa"/>
-              <w:start w:w="100" w:type="dxa"/>
-              <w:bottom w:w="90" w:type="dxa"/>
-              <w:end w:w="100" w:type="dxa"/>
-            </w:tcMar>
             <w:shd w:fill="F5F8FA"/>
           </w:tcPr>
           <w:p>
@@ -2035,14 +1846,8 @@
         </w:tc>
         <w:tc>
           <w:tcPr>
-            <w:tcW w:type="dxa" w:w="2498"/>
+            <w:tcW w:type="dxa" w:w="2484"/>
             <w:vAlign w:val="center"/>
-            <w:tcMar>
-              <w:top w:w="90" w:type="dxa"/>
-              <w:start w:w="100" w:type="dxa"/>
-              <w:bottom w:w="90" w:type="dxa"/>
-              <w:end w:w="100" w:type="dxa"/>
-            </w:tcMar>
             <w:shd w:fill="F5F8FA"/>
           </w:tcPr>
           <w:p>
@@ -2068,14 +1873,8 @@
         </w:tc>
         <w:tc>
           <w:tcPr>
-            <w:tcW w:type="dxa" w:w="2498"/>
+            <w:tcW w:type="dxa" w:w="2484"/>
             <w:vAlign w:val="center"/>
-            <w:tcMar>
-              <w:top w:w="90" w:type="dxa"/>
-              <w:start w:w="100" w:type="dxa"/>
-              <w:bottom w:w="90" w:type="dxa"/>
-              <w:end w:w="100" w:type="dxa"/>
-            </w:tcMar>
             <w:shd w:fill="F5F8FA"/>
           </w:tcPr>
           <w:p>
@@ -2099,14 +1898,8 @@
         </w:tc>
         <w:tc>
           <w:tcPr>
-            <w:tcW w:type="dxa" w:w="2498"/>
+            <w:tcW w:type="dxa" w:w="2484"/>
             <w:vAlign w:val="center"/>
-            <w:tcMar>
-              <w:top w:w="90" w:type="dxa"/>
-              <w:start w:w="100" w:type="dxa"/>
-              <w:bottom w:w="90" w:type="dxa"/>
-              <w:end w:w="100" w:type="dxa"/>
-            </w:tcMar>
             <w:shd w:fill="F5F8FA"/>
           </w:tcPr>
           <w:p>
@@ -2132,14 +1925,8 @@
       <w:tr>
         <w:tc>
           <w:tcPr>
-            <w:tcW w:type="dxa" w:w="2498"/>
+            <w:tcW w:type="dxa" w:w="2484"/>
             <w:vAlign w:val="center"/>
-            <w:tcMar>
-              <w:top w:w="90" w:type="dxa"/>
-              <w:start w:w="100" w:type="dxa"/>
-              <w:bottom w:w="90" w:type="dxa"/>
-              <w:end w:w="100" w:type="dxa"/>
-            </w:tcMar>
           </w:tcPr>
           <w:p>
             <w:pPr>
@@ -2162,14 +1949,8 @@
         </w:tc>
         <w:tc>
           <w:tcPr>
-            <w:tcW w:type="dxa" w:w="2498"/>
+            <w:tcW w:type="dxa" w:w="2484"/>
             <w:vAlign w:val="center"/>
-            <w:tcMar>
-              <w:top w:w="90" w:type="dxa"/>
-              <w:start w:w="100" w:type="dxa"/>
-              <w:bottom w:w="90" w:type="dxa"/>
-              <w:end w:w="100" w:type="dxa"/>
-            </w:tcMar>
           </w:tcPr>
           <w:p>
             <w:pPr>
@@ -2194,14 +1975,8 @@
         </w:tc>
         <w:tc>
           <w:tcPr>
-            <w:tcW w:type="dxa" w:w="2498"/>
+            <w:tcW w:type="dxa" w:w="2484"/>
             <w:vAlign w:val="center"/>
-            <w:tcMar>
-              <w:top w:w="90" w:type="dxa"/>
-              <w:start w:w="100" w:type="dxa"/>
-              <w:bottom w:w="90" w:type="dxa"/>
-              <w:end w:w="100" w:type="dxa"/>
-            </w:tcMar>
           </w:tcPr>
           <w:p>
             <w:pPr>
@@ -2224,14 +1999,8 @@
         </w:tc>
         <w:tc>
           <w:tcPr>
-            <w:tcW w:type="dxa" w:w="2498"/>
+            <w:tcW w:type="dxa" w:w="2484"/>
             <w:vAlign w:val="center"/>
-            <w:tcMar>
-              <w:top w:w="90" w:type="dxa"/>
-              <w:start w:w="100" w:type="dxa"/>
-              <w:bottom w:w="90" w:type="dxa"/>
-              <w:end w:w="100" w:type="dxa"/>
-            </w:tcMar>
           </w:tcPr>
           <w:p>
             <w:pPr>
@@ -2256,14 +2025,8 @@
       <w:tr>
         <w:tc>
           <w:tcPr>
-            <w:tcW w:type="dxa" w:w="2498"/>
+            <w:tcW w:type="dxa" w:w="2484"/>
             <w:vAlign w:val="center"/>
-            <w:tcMar>
-              <w:top w:w="90" w:type="dxa"/>
-              <w:start w:w="100" w:type="dxa"/>
-              <w:bottom w:w="90" w:type="dxa"/>
-              <w:end w:w="100" w:type="dxa"/>
-            </w:tcMar>
             <w:shd w:fill="F5F8FA"/>
           </w:tcPr>
           <w:p>
@@ -2287,14 +2050,8 @@
         </w:tc>
         <w:tc>
           <w:tcPr>
-            <w:tcW w:type="dxa" w:w="2498"/>
+            <w:tcW w:type="dxa" w:w="2484"/>
             <w:vAlign w:val="center"/>
-            <w:tcMar>
-              <w:top w:w="90" w:type="dxa"/>
-              <w:start w:w="100" w:type="dxa"/>
-              <w:bottom w:w="90" w:type="dxa"/>
-              <w:end w:w="100" w:type="dxa"/>
-            </w:tcMar>
             <w:shd w:fill="F5F8FA"/>
           </w:tcPr>
           <w:p>
@@ -2320,14 +2077,8 @@
         </w:tc>
         <w:tc>
           <w:tcPr>
-            <w:tcW w:type="dxa" w:w="2498"/>
+            <w:tcW w:type="dxa" w:w="2484"/>
             <w:vAlign w:val="center"/>
-            <w:tcMar>
-              <w:top w:w="90" w:type="dxa"/>
-              <w:start w:w="100" w:type="dxa"/>
-              <w:bottom w:w="90" w:type="dxa"/>
-              <w:end w:w="100" w:type="dxa"/>
-            </w:tcMar>
             <w:shd w:fill="F5F8FA"/>
           </w:tcPr>
           <w:p>
@@ -2351,14 +2102,8 @@
         </w:tc>
         <w:tc>
           <w:tcPr>
-            <w:tcW w:type="dxa" w:w="2498"/>
+            <w:tcW w:type="dxa" w:w="2484"/>
             <w:vAlign w:val="center"/>
-            <w:tcMar>
-              <w:top w:w="90" w:type="dxa"/>
-              <w:start w:w="100" w:type="dxa"/>
-              <w:bottom w:w="90" w:type="dxa"/>
-              <w:end w:w="100" w:type="dxa"/>
-            </w:tcMar>
             <w:shd w:fill="F5F8FA"/>
           </w:tcPr>
           <w:p>
@@ -2384,14 +2129,8 @@
       <w:tr>
         <w:tc>
           <w:tcPr>
-            <w:tcW w:type="dxa" w:w="2498"/>
+            <w:tcW w:type="dxa" w:w="2484"/>
             <w:vAlign w:val="center"/>
-            <w:tcMar>
-              <w:top w:w="90" w:type="dxa"/>
-              <w:start w:w="100" w:type="dxa"/>
-              <w:bottom w:w="90" w:type="dxa"/>
-              <w:end w:w="100" w:type="dxa"/>
-            </w:tcMar>
           </w:tcPr>
           <w:p>
             <w:pPr>
@@ -2414,14 +2153,8 @@
         </w:tc>
         <w:tc>
           <w:tcPr>
-            <w:tcW w:type="dxa" w:w="2498"/>
+            <w:tcW w:type="dxa" w:w="2484"/>
             <w:vAlign w:val="center"/>
-            <w:tcMar>
-              <w:top w:w="90" w:type="dxa"/>
-              <w:start w:w="100" w:type="dxa"/>
-              <w:bottom w:w="90" w:type="dxa"/>
-              <w:end w:w="100" w:type="dxa"/>
-            </w:tcMar>
           </w:tcPr>
           <w:p>
             <w:pPr>
@@ -2446,14 +2179,8 @@
         </w:tc>
         <w:tc>
           <w:tcPr>
-            <w:tcW w:type="dxa" w:w="2498"/>
+            <w:tcW w:type="dxa" w:w="2484"/>
             <w:vAlign w:val="center"/>
-            <w:tcMar>
-              <w:top w:w="90" w:type="dxa"/>
-              <w:start w:w="100" w:type="dxa"/>
-              <w:bottom w:w="90" w:type="dxa"/>
-              <w:end w:w="100" w:type="dxa"/>
-            </w:tcMar>
           </w:tcPr>
           <w:p>
             <w:pPr>
@@ -2476,14 +2203,8 @@
         </w:tc>
         <w:tc>
           <w:tcPr>
-            <w:tcW w:type="dxa" w:w="2498"/>
+            <w:tcW w:type="dxa" w:w="2484"/>
             <w:vAlign w:val="center"/>
-            <w:tcMar>
-              <w:top w:w="90" w:type="dxa"/>
-              <w:start w:w="100" w:type="dxa"/>
-              <w:bottom w:w="90" w:type="dxa"/>
-              <w:end w:w="100" w:type="dxa"/>
-            </w:tcMar>
           </w:tcPr>
           <w:p>
             <w:pPr>
@@ -3173,24 +2894,17 @@
         <w:tblStyle w:val="TableGrid"/>
         <w:tblW w:type="auto" w:w="0"/>
         <w:jc w:val="center"/>
-        <w:tblLayout w:type="autofit"/>
         <w:tblLook w:firstColumn="1" w:firstRow="1" w:lastColumn="0" w:lastRow="0" w:noHBand="0" w:noVBand="1" w:val="04A0"/>
       </w:tblPr>
       <w:tblGrid>
-        <w:gridCol w:w="4997"/>
-        <w:gridCol w:w="4997"/>
+        <w:gridCol w:w="4968"/>
+        <w:gridCol w:w="4968"/>
       </w:tblGrid>
       <w:tr>
         <w:tc>
           <w:tcPr>
-            <w:tcW w:type="dxa" w:w="4997"/>
+            <w:tcW w:type="dxa" w:w="4968"/>
             <w:vAlign w:val="center"/>
-            <w:tcMar>
-              <w:top w:w="90" w:type="dxa"/>
-              <w:start w:w="100" w:type="dxa"/>
-              <w:bottom w:w="90" w:type="dxa"/>
-              <w:end w:w="100" w:type="dxa"/>
-            </w:tcMar>
             <w:shd w:fill="17365D"/>
           </w:tcPr>
           <w:p>
@@ -3217,14 +2931,8 @@
         </w:tc>
         <w:tc>
           <w:tcPr>
-            <w:tcW w:type="dxa" w:w="4997"/>
+            <w:tcW w:type="dxa" w:w="4968"/>
             <w:vAlign w:val="center"/>
-            <w:tcMar>
-              <w:top w:w="90" w:type="dxa"/>
-              <w:start w:w="100" w:type="dxa"/>
-              <w:bottom w:w="90" w:type="dxa"/>
-              <w:end w:w="100" w:type="dxa"/>
-            </w:tcMar>
             <w:shd w:fill="17365D"/>
           </w:tcPr>
           <w:p>
@@ -3253,14 +2961,8 @@
       <w:tr>
         <w:tc>
           <w:tcPr>
-            <w:tcW w:type="dxa" w:w="4997"/>
+            <w:tcW w:type="dxa" w:w="4968"/>
             <w:vAlign w:val="center"/>
-            <w:tcMar>
-              <w:top w:w="90" w:type="dxa"/>
-              <w:start w:w="100" w:type="dxa"/>
-              <w:bottom w:w="90" w:type="dxa"/>
-              <w:end w:w="100" w:type="dxa"/>
-            </w:tcMar>
           </w:tcPr>
           <w:p>
             <w:pPr>
@@ -3285,14 +2987,8 @@
         </w:tc>
         <w:tc>
           <w:tcPr>
-            <w:tcW w:type="dxa" w:w="4997"/>
+            <w:tcW w:type="dxa" w:w="4968"/>
             <w:vAlign w:val="center"/>
-            <w:tcMar>
-              <w:top w:w="90" w:type="dxa"/>
-              <w:start w:w="100" w:type="dxa"/>
-              <w:bottom w:w="90" w:type="dxa"/>
-              <w:end w:w="100" w:type="dxa"/>
-            </w:tcMar>
           </w:tcPr>
           <w:p>
             <w:pPr>
@@ -3317,14 +3013,8 @@
       <w:tr>
         <w:tc>
           <w:tcPr>
-            <w:tcW w:type="dxa" w:w="4997"/>
+            <w:tcW w:type="dxa" w:w="4968"/>
             <w:vAlign w:val="center"/>
-            <w:tcMar>
-              <w:top w:w="90" w:type="dxa"/>
-              <w:start w:w="100" w:type="dxa"/>
-              <w:bottom w:w="90" w:type="dxa"/>
-              <w:end w:w="100" w:type="dxa"/>
-            </w:tcMar>
             <w:shd w:fill="F5F8FA"/>
           </w:tcPr>
           <w:p>
@@ -3350,14 +3040,8 @@
         </w:tc>
         <w:tc>
           <w:tcPr>
-            <w:tcW w:type="dxa" w:w="4997"/>
+            <w:tcW w:type="dxa" w:w="4968"/>
             <w:vAlign w:val="center"/>
-            <w:tcMar>
-              <w:top w:w="90" w:type="dxa"/>
-              <w:start w:w="100" w:type="dxa"/>
-              <w:bottom w:w="90" w:type="dxa"/>
-              <w:end w:w="100" w:type="dxa"/>
-            </w:tcMar>
             <w:shd w:fill="F5F8FA"/>
           </w:tcPr>
           <w:p>
@@ -3383,14 +3067,8 @@
       <w:tr>
         <w:tc>
           <w:tcPr>
-            <w:tcW w:type="dxa" w:w="4997"/>
+            <w:tcW w:type="dxa" w:w="4968"/>
             <w:vAlign w:val="center"/>
-            <w:tcMar>
-              <w:top w:w="90" w:type="dxa"/>
-              <w:start w:w="100" w:type="dxa"/>
-              <w:bottom w:w="90" w:type="dxa"/>
-              <w:end w:w="100" w:type="dxa"/>
-            </w:tcMar>
           </w:tcPr>
           <w:p>
             <w:pPr>
@@ -3415,14 +3093,8 @@
         </w:tc>
         <w:tc>
           <w:tcPr>
-            <w:tcW w:type="dxa" w:w="4997"/>
+            <w:tcW w:type="dxa" w:w="4968"/>
             <w:vAlign w:val="center"/>
-            <w:tcMar>
-              <w:top w:w="90" w:type="dxa"/>
-              <w:start w:w="100" w:type="dxa"/>
-              <w:bottom w:w="90" w:type="dxa"/>
-              <w:end w:w="100" w:type="dxa"/>
-            </w:tcMar>
           </w:tcPr>
           <w:p>
             <w:pPr>
@@ -3447,14 +3119,8 @@
       <w:tr>
         <w:tc>
           <w:tcPr>
-            <w:tcW w:type="dxa" w:w="4997"/>
+            <w:tcW w:type="dxa" w:w="4968"/>
             <w:vAlign w:val="center"/>
-            <w:tcMar>
-              <w:top w:w="90" w:type="dxa"/>
-              <w:start w:w="100" w:type="dxa"/>
-              <w:bottom w:w="90" w:type="dxa"/>
-              <w:end w:w="100" w:type="dxa"/>
-            </w:tcMar>
             <w:shd w:fill="F5F8FA"/>
           </w:tcPr>
           <w:p>
@@ -3480,14 +3146,8 @@
         </w:tc>
         <w:tc>
           <w:tcPr>
-            <w:tcW w:type="dxa" w:w="4997"/>
+            <w:tcW w:type="dxa" w:w="4968"/>
             <w:vAlign w:val="center"/>
-            <w:tcMar>
-              <w:top w:w="90" w:type="dxa"/>
-              <w:start w:w="100" w:type="dxa"/>
-              <w:bottom w:w="90" w:type="dxa"/>
-              <w:end w:w="100" w:type="dxa"/>
-            </w:tcMar>
             <w:shd w:fill="F5F8FA"/>
           </w:tcPr>
           <w:p>
@@ -3513,14 +3173,8 @@
       <w:tr>
         <w:tc>
           <w:tcPr>
-            <w:tcW w:type="dxa" w:w="4997"/>
+            <w:tcW w:type="dxa" w:w="4968"/>
             <w:vAlign w:val="center"/>
-            <w:tcMar>
-              <w:top w:w="90" w:type="dxa"/>
-              <w:start w:w="100" w:type="dxa"/>
-              <w:bottom w:w="90" w:type="dxa"/>
-              <w:end w:w="100" w:type="dxa"/>
-            </w:tcMar>
           </w:tcPr>
           <w:p>
             <w:pPr>
@@ -3545,14 +3199,8 @@
         </w:tc>
         <w:tc>
           <w:tcPr>
-            <w:tcW w:type="dxa" w:w="4997"/>
+            <w:tcW w:type="dxa" w:w="4968"/>
             <w:vAlign w:val="center"/>
-            <w:tcMar>
-              <w:top w:w="90" w:type="dxa"/>
-              <w:start w:w="100" w:type="dxa"/>
-              <w:bottom w:w="90" w:type="dxa"/>
-              <w:end w:w="100" w:type="dxa"/>
-            </w:tcMar>
           </w:tcPr>
           <w:p>
             <w:pPr>
@@ -3577,14 +3225,8 @@
       <w:tr>
         <w:tc>
           <w:tcPr>
-            <w:tcW w:type="dxa" w:w="4997"/>
+            <w:tcW w:type="dxa" w:w="4968"/>
             <w:vAlign w:val="center"/>
-            <w:tcMar>
-              <w:top w:w="90" w:type="dxa"/>
-              <w:start w:w="100" w:type="dxa"/>
-              <w:bottom w:w="90" w:type="dxa"/>
-              <w:end w:w="100" w:type="dxa"/>
-            </w:tcMar>
             <w:shd w:fill="F5F8FA"/>
           </w:tcPr>
           <w:p>
@@ -3610,14 +3252,8 @@
         </w:tc>
         <w:tc>
           <w:tcPr>
-            <w:tcW w:type="dxa" w:w="4997"/>
+            <w:tcW w:type="dxa" w:w="4968"/>
             <w:vAlign w:val="center"/>
-            <w:tcMar>
-              <w:top w:w="90" w:type="dxa"/>
-              <w:start w:w="100" w:type="dxa"/>
-              <w:bottom w:w="90" w:type="dxa"/>
-              <w:end w:w="100" w:type="dxa"/>
-            </w:tcMar>
             <w:shd w:fill="F5F8FA"/>
           </w:tcPr>
           <w:p>
@@ -3643,14 +3279,8 @@
       <w:tr>
         <w:tc>
           <w:tcPr>
-            <w:tcW w:type="dxa" w:w="4997"/>
+            <w:tcW w:type="dxa" w:w="4968"/>
             <w:vAlign w:val="center"/>
-            <w:tcMar>
-              <w:top w:w="90" w:type="dxa"/>
-              <w:start w:w="100" w:type="dxa"/>
-              <w:bottom w:w="90" w:type="dxa"/>
-              <w:end w:w="100" w:type="dxa"/>
-            </w:tcMar>
           </w:tcPr>
           <w:p>
             <w:pPr>
@@ -3675,14 +3305,8 @@
         </w:tc>
         <w:tc>
           <w:tcPr>
-            <w:tcW w:type="dxa" w:w="4997"/>
+            <w:tcW w:type="dxa" w:w="4968"/>
             <w:vAlign w:val="center"/>
-            <w:tcMar>
-              <w:top w:w="90" w:type="dxa"/>
-              <w:start w:w="100" w:type="dxa"/>
-              <w:bottom w:w="90" w:type="dxa"/>
-              <w:end w:w="100" w:type="dxa"/>
-            </w:tcMar>
           </w:tcPr>
           <w:p>
             <w:pPr>
@@ -3707,14 +3331,8 @@
       <w:tr>
         <w:tc>
           <w:tcPr>
-            <w:tcW w:type="dxa" w:w="4997"/>
+            <w:tcW w:type="dxa" w:w="4968"/>
             <w:vAlign w:val="center"/>
-            <w:tcMar>
-              <w:top w:w="90" w:type="dxa"/>
-              <w:start w:w="100" w:type="dxa"/>
-              <w:bottom w:w="90" w:type="dxa"/>
-              <w:end w:w="100" w:type="dxa"/>
-            </w:tcMar>
             <w:shd w:fill="F5F8FA"/>
           </w:tcPr>
           <w:p>
@@ -3740,14 +3358,8 @@
         </w:tc>
         <w:tc>
           <w:tcPr>
-            <w:tcW w:type="dxa" w:w="4997"/>
+            <w:tcW w:type="dxa" w:w="4968"/>
             <w:vAlign w:val="center"/>
-            <w:tcMar>
-              <w:top w:w="90" w:type="dxa"/>
-              <w:start w:w="100" w:type="dxa"/>
-              <w:bottom w:w="90" w:type="dxa"/>
-              <w:end w:w="100" w:type="dxa"/>
-            </w:tcMar>
             <w:shd w:fill="F5F8FA"/>
           </w:tcPr>
           <w:p>
@@ -3830,7 +3442,7 @@
       <w:r>
         <w:drawing>
           <wp:inline xmlns:a="http://schemas.openxmlformats.org/drawingml/2006/main" xmlns:pic="http://schemas.openxmlformats.org/drawingml/2006/picture">
-            <wp:extent cx="5715000" cy="4167188"/>
+            <wp:extent cx="5669280" cy="4133850"/>
             <wp:docPr id="1" name="Picture 1"/>
             <wp:cNvGraphicFramePr>
               <a:graphicFrameLocks noChangeAspect="1"/>
@@ -3851,7 +3463,7 @@
                   <pic:spPr>
                     <a:xfrm>
                       <a:off x="0" y="0"/>
-                      <a:ext cx="5715000" cy="4167188"/>
+                      <a:ext cx="5669280" cy="4133850"/>
                     </a:xfrm>
                     <a:prstGeom prst="rect"/>
                   </pic:spPr>
@@ -3884,7 +3496,7 @@
       <w:r>
         <w:drawing>
           <wp:inline xmlns:a="http://schemas.openxmlformats.org/drawingml/2006/main" xmlns:pic="http://schemas.openxmlformats.org/drawingml/2006/picture">
-            <wp:extent cx="5715000" cy="4167188"/>
+            <wp:extent cx="5669280" cy="4133850"/>
             <wp:docPr id="2" name="Picture 2"/>
             <wp:cNvGraphicFramePr>
               <a:graphicFrameLocks noChangeAspect="1"/>
@@ -3905,7 +3517,7 @@
                   <pic:spPr>
                     <a:xfrm>
                       <a:off x="0" y="0"/>
-                      <a:ext cx="5715000" cy="4167188"/>
+                      <a:ext cx="5669280" cy="4133850"/>
                     </a:xfrm>
                     <a:prstGeom prst="rect"/>
                   </pic:spPr>
@@ -3938,7 +3550,7 @@
       <w:r>
         <w:drawing>
           <wp:inline xmlns:a="http://schemas.openxmlformats.org/drawingml/2006/main" xmlns:pic="http://schemas.openxmlformats.org/drawingml/2006/picture">
-            <wp:extent cx="5715000" cy="4167188"/>
+            <wp:extent cx="5669280" cy="4133850"/>
             <wp:docPr id="3" name="Picture 3"/>
             <wp:cNvGraphicFramePr>
               <a:graphicFrameLocks noChangeAspect="1"/>
@@ -3959,7 +3571,7 @@
                   <pic:spPr>
                     <a:xfrm>
                       <a:off x="0" y="0"/>
-                      <a:ext cx="5715000" cy="4167188"/>
+                      <a:ext cx="5669280" cy="4133850"/>
                     </a:xfrm>
                     <a:prstGeom prst="rect"/>
                   </pic:spPr>
@@ -3992,7 +3604,7 @@
       <w:r>
         <w:drawing>
           <wp:inline xmlns:a="http://schemas.openxmlformats.org/drawingml/2006/main" xmlns:pic="http://schemas.openxmlformats.org/drawingml/2006/picture">
-            <wp:extent cx="5715000" cy="4167188"/>
+            <wp:extent cx="5669280" cy="4133850"/>
             <wp:docPr id="4" name="Picture 4"/>
             <wp:cNvGraphicFramePr>
               <a:graphicFrameLocks noChangeAspect="1"/>
@@ -4013,7 +3625,7 @@
                   <pic:spPr>
                     <a:xfrm>
                       <a:off x="0" y="0"/>
-                      <a:ext cx="5715000" cy="4167188"/>
+                      <a:ext cx="5669280" cy="4133850"/>
                     </a:xfrm>
                     <a:prstGeom prst="rect"/>
                   </pic:spPr>
@@ -4046,7 +3658,7 @@
       <w:r>
         <w:drawing>
           <wp:inline xmlns:a="http://schemas.openxmlformats.org/drawingml/2006/main" xmlns:pic="http://schemas.openxmlformats.org/drawingml/2006/picture">
-            <wp:extent cx="5715000" cy="4528344"/>
+            <wp:extent cx="5669280" cy="4492117"/>
             <wp:docPr id="5" name="Picture 5"/>
             <wp:cNvGraphicFramePr>
               <a:graphicFrameLocks noChangeAspect="1"/>
@@ -4067,7 +3679,7 @@
                   <pic:spPr>
                     <a:xfrm>
                       <a:off x="0" y="0"/>
-                      <a:ext cx="5715000" cy="4528344"/>
+                      <a:ext cx="5669280" cy="4492117"/>
                     </a:xfrm>
                     <a:prstGeom prst="rect"/>
                   </pic:spPr>
@@ -4100,7 +3712,7 @@
       <w:r>
         <w:drawing>
           <wp:inline xmlns:a="http://schemas.openxmlformats.org/drawingml/2006/main" xmlns:pic="http://schemas.openxmlformats.org/drawingml/2006/picture">
-            <wp:extent cx="5715000" cy="4167188"/>
+            <wp:extent cx="5669280" cy="4133850"/>
             <wp:docPr id="6" name="Picture 6"/>
             <wp:cNvGraphicFramePr>
               <a:graphicFrameLocks noChangeAspect="1"/>
@@ -4121,7 +3733,7 @@
                   <pic:spPr>
                     <a:xfrm>
                       <a:off x="0" y="0"/>
-                      <a:ext cx="5715000" cy="4167188"/>
+                      <a:ext cx="5669280" cy="4133850"/>
                     </a:xfrm>
                     <a:prstGeom prst="rect"/>
                   </pic:spPr>
@@ -4154,7 +3766,7 @@
       <w:r>
         <w:drawing>
           <wp:inline xmlns:a="http://schemas.openxmlformats.org/drawingml/2006/main" xmlns:pic="http://schemas.openxmlformats.org/drawingml/2006/picture">
-            <wp:extent cx="5715000" cy="4167188"/>
+            <wp:extent cx="5669280" cy="4133850"/>
             <wp:docPr id="7" name="Picture 7"/>
             <wp:cNvGraphicFramePr>
               <a:graphicFrameLocks noChangeAspect="1"/>
@@ -4175,7 +3787,7 @@
                   <pic:spPr>
                     <a:xfrm>
                       <a:off x="0" y="0"/>
-                      <a:ext cx="5715000" cy="4167188"/>
+                      <a:ext cx="5669280" cy="4133850"/>
                     </a:xfrm>
                     <a:prstGeom prst="rect"/>
                   </pic:spPr>
@@ -4208,7 +3820,7 @@
       <w:r>
         <w:drawing>
           <wp:inline xmlns:a="http://schemas.openxmlformats.org/drawingml/2006/main" xmlns:pic="http://schemas.openxmlformats.org/drawingml/2006/picture">
-            <wp:extent cx="5715000" cy="4167188"/>
+            <wp:extent cx="5669280" cy="4133850"/>
             <wp:docPr id="8" name="Picture 8"/>
             <wp:cNvGraphicFramePr>
               <a:graphicFrameLocks noChangeAspect="1"/>
@@ -4229,7 +3841,7 @@
                   <pic:spPr>
                     <a:xfrm>
                       <a:off x="0" y="0"/>
-                      <a:ext cx="5715000" cy="4167188"/>
+                      <a:ext cx="5669280" cy="4133850"/>
                     </a:xfrm>
                     <a:prstGeom prst="rect"/>
                   </pic:spPr>
@@ -4263,570 +3875,639 @@
           <w:b w:val="0"/>
           <w:i w:val="0"/>
         </w:rPr>
-        <w:t>10. Correspondencia con la rúbrica</w:t>
+        <w:t>10. Cuestionario de verificación de autoría y defensa técnica</w:t>
       </w:r>
-    </w:p>
-    <w:tbl>
-      <w:tblPr>
-        <w:tblStyle w:val="TableGrid"/>
-        <w:tblW w:type="auto" w:w="0"/>
-        <w:jc w:val="center"/>
-        <w:tblLayout w:type="autofit"/>
-        <w:tblLook w:firstColumn="1" w:firstRow="1" w:lastColumn="0" w:lastRow="0" w:noHBand="0" w:noVBand="1" w:val="04A0"/>
-      </w:tblPr>
-      <w:tblGrid>
-        <w:gridCol w:w="4997"/>
-        <w:gridCol w:w="4997"/>
-      </w:tblGrid>
-      <w:tr>
-        <w:tc>
-          <w:tcPr>
-            <w:tcW w:type="dxa" w:w="4997"/>
-            <w:vAlign w:val="center"/>
-            <w:tcMar>
-              <w:top w:w="90" w:type="dxa"/>
-              <w:start w:w="100" w:type="dxa"/>
-              <w:bottom w:w="90" w:type="dxa"/>
-              <w:end w:w="100" w:type="dxa"/>
-            </w:tcMar>
-            <w:shd w:fill="17365D"/>
-          </w:tcPr>
-          <w:p>
-            <w:pPr>
-              <w:spacing w:after="0"/>
-            </w:pPr>
-            <w:r>
-              <w:rPr>
-                <w:b/>
-                <w:color w:val="FFFFFF"/>
-                <w:sz w:val="17"/>
-              </w:rPr>
-            </w:r>
-            <w:r>
-              <w:rPr>
-                <w:b/>
-                <w:i w:val="0"/>
-                <w:color w:val="FFFFFF"/>
-                <w:sz w:val="17"/>
-              </w:rPr>
-              <w:t>Criterio</w:t>
-            </w:r>
-          </w:p>
-        </w:tc>
-        <w:tc>
-          <w:tcPr>
-            <w:tcW w:type="dxa" w:w="4997"/>
-            <w:vAlign w:val="center"/>
-            <w:tcMar>
-              <w:top w:w="90" w:type="dxa"/>
-              <w:start w:w="100" w:type="dxa"/>
-              <w:bottom w:w="90" w:type="dxa"/>
-              <w:end w:w="100" w:type="dxa"/>
-            </w:tcMar>
-            <w:shd w:fill="17365D"/>
-          </w:tcPr>
-          <w:p>
-            <w:pPr>
-              <w:spacing w:after="0"/>
-            </w:pPr>
-            <w:r>
-              <w:rPr>
-                <w:b/>
-                <w:color w:val="FFFFFF"/>
-                <w:sz w:val="17"/>
-              </w:rPr>
-            </w:r>
-            <w:r>
-              <w:rPr>
-                <w:b/>
-                <w:i w:val="0"/>
-                <w:color w:val="FFFFFF"/>
-                <w:sz w:val="17"/>
-              </w:rPr>
-              <w:t>Evidencia que se explica o debe demostrarse</w:t>
-            </w:r>
-          </w:p>
-        </w:tc>
-      </w:tr>
-      <w:tr>
-        <w:tc>
-          <w:tcPr>
-            <w:tcW w:type="dxa" w:w="4997"/>
-            <w:vAlign w:val="center"/>
-            <w:tcMar>
-              <w:top w:w="90" w:type="dxa"/>
-              <w:start w:w="100" w:type="dxa"/>
-              <w:bottom w:w="90" w:type="dxa"/>
-              <w:end w:w="100" w:type="dxa"/>
-            </w:tcMar>
-          </w:tcPr>
-          <w:p>
-            <w:pPr>
-              <w:spacing w:after="0"/>
-            </w:pPr>
-            <w:r>
-              <w:rPr>
-                <w:sz w:val="17"/>
-              </w:rPr>
-            </w:r>
-            <w:r>
-              <w:rPr>
-                <w:b w:val="0"/>
-                <w:i w:val="0"/>
-                <w:sz w:val="17"/>
-              </w:rPr>
-              <w:t>Arquitectura backend y API REST</w:t>
-            </w:r>
-          </w:p>
-        </w:tc>
-        <w:tc>
-          <w:tcPr>
-            <w:tcW w:type="dxa" w:w="4997"/>
-            <w:vAlign w:val="center"/>
-            <w:tcMar>
-              <w:top w:w="90" w:type="dxa"/>
-              <w:start w:w="100" w:type="dxa"/>
-              <w:bottom w:w="90" w:type="dxa"/>
-              <w:end w:w="100" w:type="dxa"/>
-            </w:tcMar>
-          </w:tcPr>
-          <w:p>
-            <w:pPr>
-              <w:spacing w:after="0"/>
-            </w:pPr>
-            <w:r>
-              <w:rPr>
-                <w:sz w:val="17"/>
-              </w:rPr>
-            </w:r>
-            <w:r>
-              <w:rPr>
-                <w:b w:val="0"/>
-                <w:i w:val="0"/>
-                <w:sz w:val="17"/>
-              </w:rPr>
-              <w:t>Rutas, controladores, middleware, códigos HTTP y flujo de una operación</w:t>
-            </w:r>
-          </w:p>
-        </w:tc>
-      </w:tr>
-      <w:tr>
-        <w:tc>
-          <w:tcPr>
-            <w:tcW w:type="dxa" w:w="4997"/>
-            <w:vAlign w:val="center"/>
-            <w:tcMar>
-              <w:top w:w="90" w:type="dxa"/>
-              <w:start w:w="100" w:type="dxa"/>
-              <w:bottom w:w="90" w:type="dxa"/>
-              <w:end w:w="100" w:type="dxa"/>
-            </w:tcMar>
-            <w:shd w:fill="F5F8FA"/>
-          </w:tcPr>
-          <w:p>
-            <w:pPr>
-              <w:spacing w:after="0"/>
-            </w:pPr>
-            <w:r>
-              <w:rPr>
-                <w:sz w:val="17"/>
-              </w:rPr>
-            </w:r>
-            <w:r>
-              <w:rPr>
-                <w:b w:val="0"/>
-                <w:i w:val="0"/>
-                <w:sz w:val="17"/>
-              </w:rPr>
-              <w:t>Persistencia NoSQL y Mongoose</w:t>
-            </w:r>
-          </w:p>
-        </w:tc>
-        <w:tc>
-          <w:tcPr>
-            <w:tcW w:type="dxa" w:w="4997"/>
-            <w:vAlign w:val="center"/>
-            <w:tcMar>
-              <w:top w:w="90" w:type="dxa"/>
-              <w:start w:w="100" w:type="dxa"/>
-              <w:bottom w:w="90" w:type="dxa"/>
-              <w:end w:w="100" w:type="dxa"/>
-            </w:tcMar>
-            <w:shd w:fill="F5F8FA"/>
-          </w:tcPr>
-          <w:p>
-            <w:pPr>
-              <w:spacing w:after="0"/>
-            </w:pPr>
-            <w:r>
-              <w:rPr>
-                <w:sz w:val="17"/>
-              </w:rPr>
-            </w:r>
-            <w:r>
-              <w:rPr>
-                <w:b w:val="0"/>
-                <w:i w:val="0"/>
-                <w:sz w:val="17"/>
-              </w:rPr>
-              <w:t xml:space="preserve">Referencias </w:t>
-            </w:r>
-            <w:r>
-              <w:rPr>
-                <w:rFonts w:ascii="Consolas" w:hAnsi="Consolas"/>
-                <w:b w:val="0"/>
-                <w:i w:val="0"/>
-                <w:color w:val="167C80"/>
-                <w:sz w:val="17"/>
-              </w:rPr>
-              <w:t>ObjectId</w:t>
-            </w:r>
-            <w:r>
-              <w:rPr>
-                <w:b w:val="0"/>
-                <w:i w:val="0"/>
-                <w:sz w:val="17"/>
-              </w:rPr>
-              <w:t>/</w:t>
-            </w:r>
-            <w:r>
-              <w:rPr>
-                <w:rFonts w:ascii="Consolas" w:hAnsi="Consolas"/>
-                <w:b w:val="0"/>
-                <w:i w:val="0"/>
-                <w:color w:val="167C80"/>
-                <w:sz w:val="17"/>
-              </w:rPr>
-              <w:t>populate</w:t>
-            </w:r>
-            <w:r>
-              <w:rPr>
-                <w:b w:val="0"/>
-                <w:i w:val="0"/>
-                <w:sz w:val="17"/>
-              </w:rPr>
-              <w:t>, versiones y votos embebidos, validaciones e índice</w:t>
-            </w:r>
-          </w:p>
-        </w:tc>
-      </w:tr>
-      <w:tr>
-        <w:tc>
-          <w:tcPr>
-            <w:tcW w:type="dxa" w:w="4997"/>
-            <w:vAlign w:val="center"/>
-            <w:tcMar>
-              <w:top w:w="90" w:type="dxa"/>
-              <w:start w:w="100" w:type="dxa"/>
-              <w:bottom w:w="90" w:type="dxa"/>
-              <w:end w:w="100" w:type="dxa"/>
-            </w:tcMar>
-          </w:tcPr>
-          <w:p>
-            <w:pPr>
-              <w:spacing w:after="0"/>
-            </w:pPr>
-            <w:r>
-              <w:rPr>
-                <w:sz w:val="17"/>
-              </w:rPr>
-            </w:r>
-            <w:r>
-              <w:rPr>
-                <w:b w:val="0"/>
-                <w:i w:val="0"/>
-                <w:sz w:val="17"/>
-              </w:rPr>
-              <w:t>Seguridad JWT y variables de entorno</w:t>
-            </w:r>
-          </w:p>
-        </w:tc>
-        <w:tc>
-          <w:tcPr>
-            <w:tcW w:type="dxa" w:w="4997"/>
-            <w:vAlign w:val="center"/>
-            <w:tcMar>
-              <w:top w:w="90" w:type="dxa"/>
-              <w:start w:w="100" w:type="dxa"/>
-              <w:bottom w:w="90" w:type="dxa"/>
-              <w:end w:w="100" w:type="dxa"/>
-            </w:tcMar>
-          </w:tcPr>
-          <w:p>
-            <w:pPr>
-              <w:spacing w:after="0"/>
-            </w:pPr>
-            <w:r>
-              <w:rPr>
-                <w:sz w:val="17"/>
-              </w:rPr>
-            </w:r>
-            <w:r>
-              <w:rPr>
-                <w:b w:val="0"/>
-                <w:i w:val="0"/>
-                <w:sz w:val="17"/>
-              </w:rPr>
-              <w:t>Hash de contraseñas, token firmado, middleware de protección y secreto externo</w:t>
-            </w:r>
-          </w:p>
-        </w:tc>
-      </w:tr>
-      <w:tr>
-        <w:tc>
-          <w:tcPr>
-            <w:tcW w:type="dxa" w:w="4997"/>
-            <w:vAlign w:val="center"/>
-            <w:tcMar>
-              <w:top w:w="90" w:type="dxa"/>
-              <w:start w:w="100" w:type="dxa"/>
-              <w:bottom w:w="90" w:type="dxa"/>
-              <w:end w:w="100" w:type="dxa"/>
-            </w:tcMar>
-            <w:shd w:fill="F5F8FA"/>
-          </w:tcPr>
-          <w:p>
-            <w:pPr>
-              <w:spacing w:after="0"/>
-            </w:pPr>
-            <w:r>
-              <w:rPr>
-                <w:sz w:val="17"/>
-              </w:rPr>
-            </w:r>
-            <w:r>
-              <w:rPr>
-                <w:b w:val="0"/>
-                <w:i w:val="0"/>
-                <w:sz w:val="17"/>
-              </w:rPr>
-              <w:t>Frontend React SPA</w:t>
-            </w:r>
-          </w:p>
-        </w:tc>
-        <w:tc>
-          <w:tcPr>
-            <w:tcW w:type="dxa" w:w="4997"/>
-            <w:vAlign w:val="center"/>
-            <w:tcMar>
-              <w:top w:w="90" w:type="dxa"/>
-              <w:start w:w="100" w:type="dxa"/>
-              <w:bottom w:w="90" w:type="dxa"/>
-              <w:end w:w="100" w:type="dxa"/>
-            </w:tcMar>
-            <w:shd w:fill="F5F8FA"/>
-          </w:tcPr>
-          <w:p>
-            <w:pPr>
-              <w:spacing w:after="0"/>
-            </w:pPr>
-            <w:r>
-              <w:rPr>
-                <w:sz w:val="17"/>
-              </w:rPr>
-            </w:r>
-            <w:r>
-              <w:rPr>
-                <w:b w:val="0"/>
-                <w:i w:val="0"/>
-                <w:sz w:val="17"/>
-              </w:rPr>
-              <w:t xml:space="preserve">Hooks </w:t>
-            </w:r>
-            <w:r>
-              <w:rPr>
-                <w:rFonts w:ascii="Consolas" w:hAnsi="Consolas"/>
-                <w:b w:val="0"/>
-                <w:i w:val="0"/>
-                <w:color w:val="167C80"/>
-                <w:sz w:val="17"/>
-              </w:rPr>
-              <w:t>useState</w:t>
-            </w:r>
-            <w:r>
-              <w:rPr>
-                <w:b w:val="0"/>
-                <w:i w:val="0"/>
-                <w:sz w:val="17"/>
-              </w:rPr>
-              <w:t>/</w:t>
-            </w:r>
-            <w:r>
-              <w:rPr>
-                <w:rFonts w:ascii="Consolas" w:hAnsi="Consolas"/>
-                <w:b w:val="0"/>
-                <w:i w:val="0"/>
-                <w:color w:val="167C80"/>
-                <w:sz w:val="17"/>
-              </w:rPr>
-              <w:t>useEffect</w:t>
-            </w:r>
-            <w:r>
-              <w:rPr>
-                <w:b w:val="0"/>
-                <w:i w:val="0"/>
-                <w:sz w:val="17"/>
-              </w:rPr>
-              <w:t>, navegación protegida, búsqueda, filtros y cliente Axios</w:t>
-            </w:r>
-          </w:p>
-        </w:tc>
-      </w:tr>
-      <w:tr>
-        <w:tc>
-          <w:tcPr>
-            <w:tcW w:type="dxa" w:w="4997"/>
-            <w:vAlign w:val="center"/>
-            <w:tcMar>
-              <w:top w:w="90" w:type="dxa"/>
-              <w:start w:w="100" w:type="dxa"/>
-              <w:bottom w:w="90" w:type="dxa"/>
-              <w:end w:w="100" w:type="dxa"/>
-            </w:tcMar>
-          </w:tcPr>
-          <w:p>
-            <w:pPr>
-              <w:spacing w:after="0"/>
-            </w:pPr>
-            <w:r>
-              <w:rPr>
-                <w:sz w:val="17"/>
-              </w:rPr>
-            </w:r>
-            <w:r>
-              <w:rPr>
-                <w:b w:val="0"/>
-                <w:i w:val="0"/>
-                <w:sz w:val="17"/>
-              </w:rPr>
-              <w:t>Despliegue, repositorio y documentación</w:t>
-            </w:r>
-          </w:p>
-        </w:tc>
-        <w:tc>
-          <w:tcPr>
-            <w:tcW w:type="dxa" w:w="4997"/>
-            <w:vAlign w:val="center"/>
-            <w:tcMar>
-              <w:top w:w="90" w:type="dxa"/>
-              <w:start w:w="100" w:type="dxa"/>
-              <w:bottom w:w="90" w:type="dxa"/>
-              <w:end w:w="100" w:type="dxa"/>
-            </w:tcMar>
-          </w:tcPr>
-          <w:p>
-            <w:pPr>
-              <w:spacing w:after="0"/>
-            </w:pPr>
-            <w:r>
-              <w:rPr>
-                <w:sz w:val="17"/>
-              </w:rPr>
-            </w:r>
-            <w:r>
-              <w:rPr>
-                <w:b w:val="0"/>
-                <w:i w:val="0"/>
-                <w:sz w:val="17"/>
-              </w:rPr>
-              <w:t>Instalación reproducible, configuración MongoDB, lockfiles y exclusión de dependencias instaladas</w:t>
-            </w:r>
-          </w:p>
-        </w:tc>
-      </w:tr>
-      <w:tr>
-        <w:tc>
-          <w:tcPr>
-            <w:tcW w:type="dxa" w:w="4997"/>
-            <w:vAlign w:val="center"/>
-            <w:tcMar>
-              <w:top w:w="90" w:type="dxa"/>
-              <w:start w:w="100" w:type="dxa"/>
-              <w:bottom w:w="90" w:type="dxa"/>
-              <w:end w:w="100" w:type="dxa"/>
-            </w:tcMar>
-            <w:shd w:fill="F5F8FA"/>
-          </w:tcPr>
-          <w:p>
-            <w:pPr>
-              <w:spacing w:after="0"/>
-            </w:pPr>
-            <w:r>
-              <w:rPr>
-                <w:sz w:val="17"/>
-              </w:rPr>
-            </w:r>
-            <w:r>
-              <w:rPr>
-                <w:b w:val="0"/>
-                <w:i w:val="0"/>
-                <w:sz w:val="17"/>
-              </w:rPr>
-              <w:t>Defensa y autoría</w:t>
-            </w:r>
-          </w:p>
-        </w:tc>
-        <w:tc>
-          <w:tcPr>
-            <w:tcW w:type="dxa" w:w="4997"/>
-            <w:vAlign w:val="center"/>
-            <w:tcMar>
-              <w:top w:w="90" w:type="dxa"/>
-              <w:start w:w="100" w:type="dxa"/>
-              <w:bottom w:w="90" w:type="dxa"/>
-              <w:end w:w="100" w:type="dxa"/>
-            </w:tcMar>
-            <w:shd w:fill="F5F8FA"/>
-          </w:tcPr>
-          <w:p>
-            <w:pPr>
-              <w:spacing w:after="0"/>
-            </w:pPr>
-            <w:r>
-              <w:rPr>
-                <w:sz w:val="17"/>
-              </w:rPr>
-            </w:r>
-            <w:r>
-              <w:rPr>
-                <w:b w:val="0"/>
-                <w:i w:val="0"/>
-                <w:sz w:val="17"/>
-              </w:rPr>
-              <w:t>Justificar referencias y subdocumentos, explicar el cálculo del score y describir el payload JWT</w:t>
-            </w:r>
-          </w:p>
-        </w:tc>
-      </w:tr>
-    </w:tbl>
-    <w:p>
-      <w:pPr>
-        <w:spacing w:after="0"/>
-      </w:pPr>
     </w:p>
     <w:p>
       <w:pPr>
-        <w:pStyle w:val="Heading2"/>
+        <w:pStyle w:val="Heading3"/>
       </w:pPr>
       <w:r>
         <w:rPr>
           <w:b w:val="0"/>
           <w:i w:val="0"/>
         </w:rPr>
-        <w:t>11. Guion oral sugerido</w:t>
+        <w:t>1. Flujo integral de autenticación</w:t>
+      </w:r>
+    </w:p>
+    <w:p>
+      <w:r>
+        <w:rPr>
+          <w:b/>
+          <w:i w:val="0"/>
+        </w:rPr>
+        <w:t>Pregunta:</w:t>
+      </w:r>
+      <w:r>
+        <w:rPr>
+          <w:b w:val="0"/>
+          <w:i w:val="0"/>
+        </w:rPr>
+        <w:t xml:space="preserve"> Explique el ciclo de vida de la autenticación: desde el ingreso de credenciales en React, la generación del JWT en el backend, hasta el envío de </w:t>
+      </w:r>
+      <w:r>
+        <w:rPr>
+          <w:rFonts w:ascii="Consolas" w:hAnsi="Consolas"/>
+          <w:b w:val="0"/>
+          <w:i w:val="0"/>
+          <w:color w:val="167C80"/>
+          <w:sz w:val="18"/>
+        </w:rPr>
+        <w:t>Authorization: Bearer &lt;token&gt;</w:t>
+      </w:r>
+      <w:r>
+        <w:rPr>
+          <w:b w:val="0"/>
+          <w:i w:val="0"/>
+        </w:rPr>
+        <w:t xml:space="preserve"> y la validación en una ruta protegida.</w:t>
+      </w:r>
+    </w:p>
+    <w:p>
+      <w:r>
+        <w:rPr>
+          <w:b/>
+          <w:i w:val="0"/>
+        </w:rPr>
+        <w:t>Respuesta:</w:t>
+      </w:r>
+      <w:r>
+        <w:rPr>
+          <w:b w:val="0"/>
+          <w:i w:val="0"/>
+        </w:rPr>
+        <w:t xml:space="preserve"> En el registro o inicio de sesión, React envía el correo y la contraseña a </w:t>
+      </w:r>
+      <w:r>
+        <w:rPr>
+          <w:rFonts w:ascii="Consolas" w:hAnsi="Consolas"/>
+          <w:b w:val="0"/>
+          <w:i w:val="0"/>
+          <w:color w:val="167C80"/>
+          <w:sz w:val="18"/>
+        </w:rPr>
+        <w:t>POST /api/auth/register</w:t>
+      </w:r>
+      <w:r>
+        <w:rPr>
+          <w:b w:val="0"/>
+          <w:i w:val="0"/>
+        </w:rPr>
+        <w:t xml:space="preserve"> o </w:t>
+      </w:r>
+      <w:r>
+        <w:rPr>
+          <w:rFonts w:ascii="Consolas" w:hAnsi="Consolas"/>
+          <w:b w:val="0"/>
+          <w:i w:val="0"/>
+          <w:color w:val="167C80"/>
+          <w:sz w:val="18"/>
+        </w:rPr>
+        <w:t>POST /api/auth/login</w:t>
+      </w:r>
+      <w:r>
+        <w:rPr>
+          <w:b w:val="0"/>
+          <w:i w:val="0"/>
+        </w:rPr>
+        <w:t xml:space="preserve">. El backend comprueba los datos; en el inicio de sesión compara la contraseña con su hash bcrypt. Si son válidos, </w:t>
+      </w:r>
+      <w:r>
+        <w:rPr>
+          <w:rFonts w:ascii="Consolas" w:hAnsi="Consolas"/>
+          <w:b w:val="0"/>
+          <w:i w:val="0"/>
+          <w:color w:val="167C80"/>
+          <w:sz w:val="18"/>
+        </w:rPr>
+        <w:t>generateToken</w:t>
+      </w:r>
+      <w:r>
+        <w:rPr>
+          <w:b w:val="0"/>
+          <w:i w:val="0"/>
+        </w:rPr>
+        <w:t xml:space="preserve"> firma un JWT con el identificador de usuario y una fecha de expiración. El frontend guarda el token en </w:t>
+      </w:r>
+      <w:r>
+        <w:rPr>
+          <w:rFonts w:ascii="Consolas" w:hAnsi="Consolas"/>
+          <w:b w:val="0"/>
+          <w:i w:val="0"/>
+          <w:color w:val="167C80"/>
+          <w:sz w:val="18"/>
+        </w:rPr>
+        <w:t>localStorage</w:t>
+      </w:r>
+      <w:r>
+        <w:rPr>
+          <w:b w:val="0"/>
+          <w:i w:val="0"/>
+        </w:rPr>
+        <w:t xml:space="preserve">. El cliente Axios lo agrega a las solicitudes protegidas como </w:t>
+      </w:r>
+      <w:r>
+        <w:rPr>
+          <w:rFonts w:ascii="Consolas" w:hAnsi="Consolas"/>
+          <w:b w:val="0"/>
+          <w:i w:val="0"/>
+          <w:color w:val="167C80"/>
+          <w:sz w:val="18"/>
+        </w:rPr>
+        <w:t>Authorization: Bearer &lt;token&gt;</w:t>
+      </w:r>
+      <w:r>
+        <w:rPr>
+          <w:b w:val="0"/>
+          <w:i w:val="0"/>
+        </w:rPr>
+        <w:t xml:space="preserve">. En el middleware </w:t>
+      </w:r>
+      <w:r>
+        <w:rPr>
+          <w:rFonts w:ascii="Consolas" w:hAnsi="Consolas"/>
+          <w:b w:val="0"/>
+          <w:i w:val="0"/>
+          <w:color w:val="167C80"/>
+          <w:sz w:val="18"/>
+        </w:rPr>
+        <w:t>protect</w:t>
+      </w:r>
+      <w:r>
+        <w:rPr>
+          <w:b w:val="0"/>
+          <w:i w:val="0"/>
+        </w:rPr>
+        <w:t xml:space="preserve">, el backend extrae el token, ejecuta </w:t>
+      </w:r>
+      <w:r>
+        <w:rPr>
+          <w:rFonts w:ascii="Consolas" w:hAnsi="Consolas"/>
+          <w:b w:val="0"/>
+          <w:i w:val="0"/>
+          <w:color w:val="167C80"/>
+          <w:sz w:val="18"/>
+        </w:rPr>
+        <w:t>jwt.verify</w:t>
+      </w:r>
+      <w:r>
+        <w:rPr>
+          <w:b w:val="0"/>
+          <w:i w:val="0"/>
+        </w:rPr>
+        <w:t xml:space="preserve"> con </w:t>
+      </w:r>
+      <w:r>
+        <w:rPr>
+          <w:rFonts w:ascii="Consolas" w:hAnsi="Consolas"/>
+          <w:b w:val="0"/>
+          <w:i w:val="0"/>
+          <w:color w:val="167C80"/>
+          <w:sz w:val="18"/>
+        </w:rPr>
+        <w:t>JWT_SECRET</w:t>
+      </w:r>
+      <w:r>
+        <w:rPr>
+          <w:b w:val="0"/>
+          <w:i w:val="0"/>
+        </w:rPr>
+        <w:t xml:space="preserve">, busca al usuario correspondiente y continúa la solicitud solo si el token es válido y la cuenta está activa. Después, </w:t>
+      </w:r>
+      <w:r>
+        <w:rPr>
+          <w:rFonts w:ascii="Consolas" w:hAnsi="Consolas"/>
+          <w:b w:val="0"/>
+          <w:i w:val="0"/>
+          <w:color w:val="167C80"/>
+          <w:sz w:val="18"/>
+        </w:rPr>
+        <w:t>authorize</w:t>
+      </w:r>
+      <w:r>
+        <w:rPr>
+          <w:b w:val="0"/>
+          <w:i w:val="0"/>
+        </w:rPr>
+        <w:t xml:space="preserve"> comprueba los permisos de rol cuando la ruta lo requiere.</w:t>
       </w:r>
     </w:p>
     <w:p>
       <w:pPr>
-        <w:pStyle w:val="Quote"/>
-        <w:ind w:left="360"/>
+        <w:pStyle w:val="Heading3"/>
       </w:pPr>
       <w:r>
         <w:rPr>
           <w:b w:val="0"/>
           <w:i w:val="0"/>
         </w:rPr>
-        <w:t>Buenos días. Soy Eva Lizeth Chino Quispe y voy a presentar PromptVault, un repositorio para crear, organizar y mejorar prompts. El problema que busca resolver es que las instrucciones útiles suelen quedar dispersas, por lo que después cuesta encontrarlas y reconocer qué cambios ayudaron a mejorarlas.</w:t>
+        <w:t>2. Justificación del modelado NoSQL con Mongoose</w:t>
+      </w:r>
+    </w:p>
+    <w:p>
+      <w:r>
+        <w:rPr>
+          <w:b/>
+          <w:i w:val="0"/>
+        </w:rPr>
+        <w:t>Pregunta:</w:t>
+      </w:r>
+      <w:r>
+        <w:rPr>
+          <w:b w:val="0"/>
+          <w:i w:val="0"/>
+        </w:rPr>
+        <w:t xml:space="preserve"> ¿Qué colecciones estableció y por qué utilizó referencias cruzadas en lugar de embeber todos los datos? Explique el efecto en escalabilidad y consistencia.</w:t>
+      </w:r>
+    </w:p>
+    <w:p>
+      <w:r>
+        <w:rPr>
+          <w:b/>
+          <w:i w:val="0"/>
+        </w:rPr>
+        <w:t>Respuesta:</w:t>
+      </w:r>
+      <w:r>
+        <w:rPr>
+          <w:b w:val="0"/>
+          <w:i w:val="0"/>
+        </w:rPr>
+        <w:t xml:space="preserve"> El sistema utiliza las colecciones </w:t>
+      </w:r>
+      <w:r>
+        <w:rPr>
+          <w:rFonts w:ascii="Consolas" w:hAnsi="Consolas"/>
+          <w:b w:val="0"/>
+          <w:i w:val="0"/>
+          <w:color w:val="167C80"/>
+          <w:sz w:val="18"/>
+        </w:rPr>
+        <w:t>users</w:t>
+      </w:r>
+      <w:r>
+        <w:rPr>
+          <w:b w:val="0"/>
+          <w:i w:val="0"/>
+        </w:rPr>
+        <w:t xml:space="preserve"> y </w:t>
+      </w:r>
+      <w:r>
+        <w:rPr>
+          <w:rFonts w:ascii="Consolas" w:hAnsi="Consolas"/>
+          <w:b w:val="0"/>
+          <w:i w:val="0"/>
+          <w:color w:val="167C80"/>
+          <w:sz w:val="18"/>
+        </w:rPr>
+        <w:t>prompts</w:t>
+      </w:r>
+      <w:r>
+        <w:rPr>
+          <w:b w:val="0"/>
+          <w:i w:val="0"/>
+        </w:rPr>
+        <w:t xml:space="preserve">. Cada prompt referencia mediante </w:t>
+      </w:r>
+      <w:r>
+        <w:rPr>
+          <w:rFonts w:ascii="Consolas" w:hAnsi="Consolas"/>
+          <w:b w:val="0"/>
+          <w:i w:val="0"/>
+          <w:color w:val="167C80"/>
+          <w:sz w:val="18"/>
+        </w:rPr>
+        <w:t>ObjectId</w:t>
+      </w:r>
+      <w:r>
+        <w:rPr>
+          <w:b w:val="0"/>
+          <w:i w:val="0"/>
+        </w:rPr>
+        <w:t xml:space="preserve"> a su autor. Las versiones y los votos guardan referencias a los usuarios que los crearon o emitieron. </w:t>
+      </w:r>
+      <w:r>
+        <w:rPr>
+          <w:rFonts w:ascii="Consolas" w:hAnsi="Consolas"/>
+          <w:b w:val="0"/>
+          <w:i w:val="0"/>
+          <w:color w:val="167C80"/>
+          <w:sz w:val="18"/>
+        </w:rPr>
+        <w:t>populate</w:t>
+      </w:r>
+      <w:r>
+        <w:rPr>
+          <w:b w:val="0"/>
+          <w:i w:val="0"/>
+        </w:rPr>
+        <w:t xml:space="preserve"> permite consultar los datos de autoría sin copiar el perfil completo dentro de cada prompt. Las versiones y los votos se conservan como subdocumentos del prompt porque forman parte de su historial y se consultan junto al contenido. Así se reduce la duplicación de perfiles, se mantiene consistente la identidad del usuario y se agrupan los datos que pertenecen al ciclo de vida de cada prompt.</w:t>
+      </w:r>
+    </w:p>
+    <w:p>
+      <w:pPr>
+        <w:pStyle w:val="Heading3"/>
+      </w:pPr>
+      <w:r>
+        <w:rPr>
+          <w:b w:val="0"/>
+          <w:i w:val="0"/>
+        </w:rPr>
+        <w:t>3. Manejo seguro de secretos y configuración</w:t>
+      </w:r>
+    </w:p>
+    <w:p>
+      <w:r>
+        <w:rPr>
+          <w:b/>
+          <w:i w:val="0"/>
+        </w:rPr>
+        <w:t>Pregunta:</w:t>
+      </w:r>
+      <w:r>
+        <w:rPr>
+          <w:b w:val="0"/>
+          <w:i w:val="0"/>
+        </w:rPr>
+        <w:t xml:space="preserve"> ¿Por qué es mala práctica escribir contraseñas de base de datos o secretos JWT directamente en el código? ¿Cómo ayudan </w:t>
+      </w:r>
+      <w:r>
+        <w:rPr>
+          <w:rFonts w:ascii="Consolas" w:hAnsi="Consolas"/>
+          <w:b w:val="0"/>
+          <w:i w:val="0"/>
+          <w:color w:val="167C80"/>
+          <w:sz w:val="18"/>
+        </w:rPr>
+        <w:t>dotenv</w:t>
+      </w:r>
+      <w:r>
+        <w:rPr>
+          <w:b w:val="0"/>
+          <w:i w:val="0"/>
+        </w:rPr>
+        <w:t xml:space="preserve"> y </w:t>
+      </w:r>
+      <w:r>
+        <w:rPr>
+          <w:rFonts w:ascii="Consolas" w:hAnsi="Consolas"/>
+          <w:b w:val="0"/>
+          <w:i w:val="0"/>
+          <w:color w:val="167C80"/>
+          <w:sz w:val="18"/>
+        </w:rPr>
+        <w:t>.gitignore</w:t>
+      </w:r>
+      <w:r>
+        <w:rPr>
+          <w:b w:val="0"/>
+          <w:i w:val="0"/>
+        </w:rPr>
+        <w:t>?</w:t>
+      </w:r>
+    </w:p>
+    <w:p>
+      <w:r>
+        <w:rPr>
+          <w:b/>
+          <w:i w:val="0"/>
+        </w:rPr>
+        <w:t>Respuesta:</w:t>
+      </w:r>
+      <w:r>
+        <w:rPr>
+          <w:b w:val="0"/>
+          <w:i w:val="0"/>
+        </w:rPr>
+        <w:t xml:space="preserve"> Un secreto escrito en el código puede terminar en Git, en copias del repositorio o en registros compartidos; alguien que lo obtenga podría conectarse a la base de datos o firmar tokens. PromptVault carga la configuración con </w:t>
+      </w:r>
+      <w:r>
+        <w:rPr>
+          <w:rFonts w:ascii="Consolas" w:hAnsi="Consolas"/>
+          <w:b w:val="0"/>
+          <w:i w:val="0"/>
+          <w:color w:val="167C80"/>
+          <w:sz w:val="18"/>
+        </w:rPr>
+        <w:t>require('dotenv').config()</w:t>
+      </w:r>
+      <w:r>
+        <w:rPr>
+          <w:b w:val="0"/>
+          <w:i w:val="0"/>
+        </w:rPr>
+        <w:t xml:space="preserve"> y lee </w:t>
+      </w:r>
+      <w:r>
+        <w:rPr>
+          <w:rFonts w:ascii="Consolas" w:hAnsi="Consolas"/>
+          <w:b w:val="0"/>
+          <w:i w:val="0"/>
+          <w:color w:val="167C80"/>
+          <w:sz w:val="18"/>
+        </w:rPr>
+        <w:t>MONGODB_URI</w:t>
+      </w:r>
+      <w:r>
+        <w:rPr>
+          <w:b w:val="0"/>
+          <w:i w:val="0"/>
+        </w:rPr>
+        <w:t xml:space="preserve"> y </w:t>
+      </w:r>
+      <w:r>
+        <w:rPr>
+          <w:rFonts w:ascii="Consolas" w:hAnsi="Consolas"/>
+          <w:b w:val="0"/>
+          <w:i w:val="0"/>
+          <w:color w:val="167C80"/>
+          <w:sz w:val="18"/>
+        </w:rPr>
+        <w:t>JWT_SECRET</w:t>
+      </w:r>
+      <w:r>
+        <w:rPr>
+          <w:b w:val="0"/>
+          <w:i w:val="0"/>
+        </w:rPr>
+        <w:t xml:space="preserve"> desde </w:t>
+      </w:r>
+      <w:r>
+        <w:rPr>
+          <w:rFonts w:ascii="Consolas" w:hAnsi="Consolas"/>
+          <w:b w:val="0"/>
+          <w:i w:val="0"/>
+          <w:color w:val="167C80"/>
+          <w:sz w:val="18"/>
+        </w:rPr>
+        <w:t>process.env</w:t>
+      </w:r>
+      <w:r>
+        <w:rPr>
+          <w:b w:val="0"/>
+          <w:i w:val="0"/>
+        </w:rPr>
+        <w:t xml:space="preserve">. El archivo </w:t>
+      </w:r>
+      <w:r>
+        <w:rPr>
+          <w:rFonts w:ascii="Consolas" w:hAnsi="Consolas"/>
+          <w:b w:val="0"/>
+          <w:i w:val="0"/>
+          <w:color w:val="167C80"/>
+          <w:sz w:val="18"/>
+        </w:rPr>
+        <w:t>.gitignore</w:t>
+      </w:r>
+      <w:r>
+        <w:rPr>
+          <w:b w:val="0"/>
+          <w:i w:val="0"/>
+        </w:rPr>
+        <w:t xml:space="preserve"> excluye </w:t>
+      </w:r>
+      <w:r>
+        <w:rPr>
+          <w:rFonts w:ascii="Consolas" w:hAnsi="Consolas"/>
+          <w:b w:val="0"/>
+          <w:i w:val="0"/>
+          <w:color w:val="167C80"/>
+          <w:sz w:val="18"/>
+        </w:rPr>
+        <w:t>.env</w:t>
+      </w:r>
+      <w:r>
+        <w:rPr>
+          <w:b w:val="0"/>
+          <w:i w:val="0"/>
+        </w:rPr>
+        <w:t xml:space="preserve">, por lo que las credenciales locales no se agregan al repositorio. Se comparte solamente </w:t>
+      </w:r>
+      <w:r>
+        <w:rPr>
+          <w:rFonts w:ascii="Consolas" w:hAnsi="Consolas"/>
+          <w:b w:val="0"/>
+          <w:i w:val="0"/>
+          <w:color w:val="167C80"/>
+          <w:sz w:val="18"/>
+        </w:rPr>
+        <w:t>.env.example</w:t>
+      </w:r>
+      <w:r>
+        <w:rPr>
+          <w:b w:val="0"/>
+          <w:i w:val="0"/>
+        </w:rPr>
+        <w:t xml:space="preserve"> con valores de ejemplo, que deben reemplazarse localmente. </w:t>
+      </w:r>
+      <w:r>
+        <w:rPr>
+          <w:rFonts w:ascii="Consolas" w:hAnsi="Consolas"/>
+          <w:b w:val="0"/>
+          <w:i w:val="0"/>
+          <w:color w:val="167C80"/>
+          <w:sz w:val="18"/>
+        </w:rPr>
+        <w:t>dotenv</w:t>
+      </w:r>
+      <w:r>
+        <w:rPr>
+          <w:b w:val="0"/>
+          <w:i w:val="0"/>
+        </w:rPr>
+        <w:t xml:space="preserve"> facilita separar configuración y código, pero la protección depende de no publicar el archivo real y de usar secretos fuertes.</w:t>
+      </w:r>
+    </w:p>
+    <w:p>
+      <w:pPr>
+        <w:pStyle w:val="Heading3"/>
+      </w:pPr>
+      <w:r>
+        <w:rPr>
+          <w:b w:val="0"/>
+          <w:i w:val="0"/>
+        </w:rPr>
+        <w:t>4. Trazabilidad de código y autoría</w:t>
+      </w:r>
+    </w:p>
+    <w:p>
+      <w:r>
+        <w:rPr>
+          <w:b/>
+          <w:i w:val="0"/>
+        </w:rPr>
+        <w:t>Pregunta:</w:t>
+      </w:r>
+      <w:r>
+        <w:rPr>
+          <w:b w:val="0"/>
+          <w:i w:val="0"/>
+        </w:rPr>
+        <w:t xml:space="preserve"> Identifique y transcriba una línea exacta del backend donde se emite o verifica el JWT. Explique qué contiene el payload y por qué no debe guardar contraseñas, incluso con hash.</w:t>
+      </w:r>
+    </w:p>
+    <w:p>
+      <w:r>
+        <w:rPr>
+          <w:b/>
+          <w:i w:val="0"/>
+        </w:rPr>
+        <w:t>Respuesta:</w:t>
+      </w:r>
+      <w:r>
+        <w:rPr>
+          <w:b w:val="0"/>
+          <w:i w:val="0"/>
+        </w:rPr>
+        <w:t xml:space="preserve"> En </w:t>
+      </w:r>
+      <w:r>
+        <w:rPr>
+          <w:rFonts w:ascii="Consolas" w:hAnsi="Consolas"/>
+          <w:b w:val="0"/>
+          <w:i w:val="0"/>
+          <w:color w:val="167C80"/>
+          <w:sz w:val="18"/>
+        </w:rPr>
+        <w:t>backend/src/controllers/authController.js</w:t>
+      </w:r>
+      <w:r>
+        <w:rPr>
+          <w:b w:val="0"/>
+          <w:i w:val="0"/>
+        </w:rPr>
+        <w:t xml:space="preserve">, </w:t>
+      </w:r>
+      <w:r>
+        <w:rPr>
+          <w:rFonts w:ascii="Consolas" w:hAnsi="Consolas"/>
+          <w:b w:val="0"/>
+          <w:i w:val="0"/>
+          <w:color w:val="167C80"/>
+          <w:sz w:val="18"/>
+        </w:rPr>
+        <w:t>generateToken</w:t>
+      </w:r>
+      <w:r>
+        <w:rPr>
+          <w:b w:val="0"/>
+          <w:i w:val="0"/>
+        </w:rPr>
+        <w:t xml:space="preserve"> emite el token con esta línea:</w:t>
+      </w:r>
+    </w:p>
+    <w:p>
+      <w:pPr>
+        <w:spacing w:before="60" w:after="160"/>
+        <w:ind w:left="173" w:right="173"/>
+        <w:shd w:fill="F3F5F7"/>
+      </w:pPr>
+      <w:r>
+        <w:rPr>
+          <w:rFonts w:ascii="Consolas" w:hAnsi="Consolas"/>
+          <w:sz w:val="17"/>
+        </w:rPr>
+        <w:t>return jwt.sign({ id }, process.env.JWT_SECRET, {</w:t>
       </w:r>
     </w:p>
     <w:p>
@@ -4835,32 +4516,89 @@
           <w:b w:val="0"/>
           <w:i w:val="0"/>
         </w:rPr>
-        <w:t>&gt;</w:t>
+        <w:t>El payload propio contiene el identificador del usuario (</w:t>
       </w:r>
-    </w:p>
-    <w:p>
-      <w:pPr>
-        <w:pStyle w:val="Quote"/>
-        <w:ind w:left="360"/>
-      </w:pPr>
+      <w:r>
+        <w:rPr>
+          <w:rFonts w:ascii="Consolas" w:hAnsi="Consolas"/>
+          <w:b w:val="0"/>
+          <w:i w:val="0"/>
+          <w:color w:val="167C80"/>
+          <w:sz w:val="18"/>
+        </w:rPr>
+        <w:t>id</w:t>
+      </w:r>
       <w:r>
         <w:rPr>
           <w:b w:val="0"/>
           <w:i w:val="0"/>
         </w:rPr>
-        <w:t>El sistema tiene una interfaz React, una API REST con Express y persistencia en MongoDB. Cada prompt referencia a su autor; las versiones y los votos se guardan como subdocumentos para consultarlos junto al contenido. En la demostración voy a iniciar sesión, buscar un prompt, abrir su historial, registrar una valoración y mostrar el formulario para crear otro aporte. El backend verifica los JWT y limita los cambios al autor o a una cuenta con permisos. El formulario público crea cuentas de estudiante; los permisos elevados no se otorgan desde el registro.</w:t>
+        <w:t xml:space="preserve">); la librería añade las marcas de tiempo del token, como </w:t>
       </w:r>
-    </w:p>
-    <w:p>
-      <w:pPr>
-        <w:pStyle w:val="Heading2"/>
-      </w:pPr>
+      <w:r>
+        <w:rPr>
+          <w:rFonts w:ascii="Consolas" w:hAnsi="Consolas"/>
+          <w:b w:val="0"/>
+          <w:i w:val="0"/>
+          <w:color w:val="167C80"/>
+          <w:sz w:val="18"/>
+        </w:rPr>
+        <w:t>iat</w:t>
+      </w:r>
       <w:r>
         <w:rPr>
           <w:b w:val="0"/>
           <w:i w:val="0"/>
         </w:rPr>
-        <w:t>12. Cierre</w:t>
+        <w:t xml:space="preserve"> y </w:t>
+      </w:r>
+      <w:r>
+        <w:rPr>
+          <w:rFonts w:ascii="Consolas" w:hAnsi="Consolas"/>
+          <w:b w:val="0"/>
+          <w:i w:val="0"/>
+          <w:color w:val="167C80"/>
+          <w:sz w:val="18"/>
+        </w:rPr>
+        <w:t>exp</w:t>
+      </w:r>
+      <w:r>
+        <w:rPr>
+          <w:b w:val="0"/>
+          <w:i w:val="0"/>
+        </w:rPr>
+        <w:t xml:space="preserve">, según la firma y su expiración configurada. La verificación se realiza en </w:t>
+      </w:r>
+      <w:r>
+        <w:rPr>
+          <w:rFonts w:ascii="Consolas" w:hAnsi="Consolas"/>
+          <w:b w:val="0"/>
+          <w:i w:val="0"/>
+          <w:color w:val="167C80"/>
+          <w:sz w:val="18"/>
+        </w:rPr>
+        <w:t>backend/src/middleware/auth.js</w:t>
+      </w:r>
+      <w:r>
+        <w:rPr>
+          <w:b w:val="0"/>
+          <w:i w:val="0"/>
+        </w:rPr>
+        <w:t>:</w:t>
+      </w:r>
+    </w:p>
+    <w:p>
+      <w:pPr>
+        <w:spacing w:before="60" w:after="160"/>
+        <w:ind w:left="173" w:right="173"/>
+        <w:shd w:fill="F3F5F7"/>
+      </w:pPr>
+      <w:r>
+        <w:rPr>
+          <w:rFonts w:ascii="Consolas" w:hAnsi="Consolas"/>
+          <w:sz w:val="17"/>
+        </w:rPr>
+        <w:t>const decoded = jwt.verify(token, process.env.JWT_SECRET);</w:t>
       </w:r>
     </w:p>
     <w:p>
@@ -4869,14 +4607,14 @@
           <w:b w:val="0"/>
           <w:i w:val="0"/>
         </w:rPr>
-        <w:t>PromptVault convierte una colección dispersa de instrucciones en un repositorio consultable y con historial. La propuesta combina una API organizada, persistencia NoSQL adecuada al ciclo de vida del prompt y una interfaz enfocada en explorar y reutilizar contenido. La exposición se completa mostrando el flujo real, las restricciones de acceso y las evidencias capturadas durante la ejecución.</w:t>
+        <w:t>El token está firmado, pero no cifrado: quien lo obtiene puede leer su payload. Por eso no se incluyen contraseñas ni hashes; ambos son información sensible, y un hash expuesto puede facilitar ataques de fuerza bruta. En este proyecto, después de verificar el token, el backend recupera el usuario desde MongoDB sin seleccionar el campo de contraseña.</w:t>
       </w:r>
     </w:p>
     <w:sectPr>
       <w:headerReference w:type="default" r:id="rId9"/>
       <w:footerReference w:type="default" r:id="rId10"/>
       <w:pgSz w:w="12240" w:h="15840"/>
-      <w:pgMar w:top="1037" w:right="1123" w:bottom="1037" w:left="1123" w:header="720" w:footer="720" w:gutter="0"/>
+      <w:pgMar w:top="1008" w:right="1152" w:bottom="1008" w:left="1152" w:header="720" w:footer="720" w:gutter="0"/>
       <w:cols w:space="720"/>
       <w:docGrid w:linePitch="360"/>
     </w:sectPr>
@@ -4911,7 +4649,6 @@
     </w:pPr>
     <w:r>
       <w:rPr>
-        <w:rFonts w:ascii="Aptos" w:hAnsi="Aptos"/>
         <w:b/>
         <w:color w:val="167C80"/>
         <w:sz w:val="16"/>
@@ -5649,7 +5386,7 @@
       <w:color w:val="17365D"/>
       <w:spacing w:val="5"/>
       <w:kern w:val="28"/>
-      <w:sz w:val="48"/>
+      <w:sz w:val="46"/>
       <w:szCs w:val="52"/>
     </w:rPr>
   </w:style>

</xml_diff>